<commit_message>
sampling strategy revision + half of the validation
</commit_message>
<xml_diff>
--- a/docs/rationale_memo.docx
+++ b/docs/rationale_memo.docx
@@ -140,7 +140,13 @@
         <w:rPr>
           <w:rFonts w:hint="eastAsia"/>
         </w:rPr>
-        <w:t>抽样怎么做</w:t>
+        <w:t>抽样</w:t>
+      </w:r>
+      <w:r>
+        <w:rPr>
+          <w:rFonts w:hint="eastAsia"/>
+        </w:rPr>
+        <w:t>原则</w:t>
       </w:r>
     </w:p>
     <w:p>
@@ -208,6 +214,12 @@
         </w:rPr>
         <w:t>必须得是社会互动。必须在社会情境下、预期别人能看到</w:t>
       </w:r>
+      <w:r>
+        <w:rPr>
+          <w:rFonts w:hint="eastAsia"/>
+        </w:rPr>
+        <w:t>。</w:t>
+      </w:r>
     </w:p>
     <w:p>
       <w:r>
@@ -269,11 +281,21 @@
         </w:rPr>
         <w:t>单纯是其他形式（</w:t>
       </w:r>
-      <w:r>
-        <w:rPr>
-          <w:rFonts w:hint="eastAsia"/>
-        </w:rPr>
-        <w:t xml:space="preserve">e.g, </w:t>
+      <w:proofErr w:type="spellStart"/>
+      <w:proofErr w:type="gramStart"/>
+      <w:r>
+        <w:rPr>
+          <w:rFonts w:hint="eastAsia"/>
+        </w:rPr>
+        <w:t>e.g</w:t>
+      </w:r>
+      <w:proofErr w:type="spellEnd"/>
+      <w:proofErr w:type="gramEnd"/>
+      <w:r>
+        <w:rPr>
+          <w:rFonts w:hint="eastAsia"/>
+        </w:rPr>
+        <w:t xml:space="preserve">, </w:t>
       </w:r>
       <w:r>
         <w:rPr>
@@ -383,73 +405,304 @@
     </w:p>
     <w:p>
       <w:pPr>
-        <w:rPr>
-          <w:rStyle w:val="a7"/>
-        </w:rPr>
-      </w:pPr>
-      <w:r>
-        <w:rPr>
-          <w:rStyle w:val="a7"/>
-        </w:rPr>
-        <w:t>决定：</w:t>
-      </w:r>
-    </w:p>
-    <w:p>
-      <w:r>
-        <w:rPr>
-          <w:rFonts w:ascii="Segoe UI Symbol" w:hAnsi="Segoe UI Symbol" w:cs="Segoe UI Symbol"/>
-        </w:rPr>
-        <w:t>✔</w:t>
-      </w:r>
-      <w:r>
-        <w:rPr>
-          <w:rFonts w:ascii="Segoe UI Symbol" w:hAnsi="Segoe UI Symbol" w:cs="Segoe UI Symbol" w:hint="eastAsia"/>
+        <w:pStyle w:val="1"/>
+        <w:rPr>
+          <w:rFonts w:hint="eastAsia"/>
+        </w:rPr>
+      </w:pPr>
+      <w:r>
+        <w:rPr>
+          <w:rFonts w:hint="eastAsia"/>
+        </w:rPr>
+        <w:t>抽样执行流程</w:t>
+      </w:r>
+    </w:p>
+    <w:p>
+      <w:pPr>
+        <w:pStyle w:val="a4"/>
+      </w:pPr>
+      <w:r>
+        <w:rPr>
+          <w:rFonts w:hint="eastAsia"/>
+        </w:rPr>
+        <w:t>如何证明我是反</w:t>
+      </w:r>
+      <w:r>
+        <w:rPr>
+          <w:rFonts w:hint="eastAsia"/>
+        </w:rPr>
+        <w:t>cherry picking</w:t>
+      </w:r>
+      <w:r>
+        <w:rPr>
+          <w:rFonts w:hint="eastAsia"/>
+        </w:rPr>
+        <w:t>的（</w:t>
+      </w:r>
+      <w:r>
+        <w:rPr>
+          <w:rFonts w:hint="eastAsia"/>
+        </w:rPr>
+        <w:t>最终我能得出稳健的</w:t>
+      </w:r>
+      <w:r>
+        <w:rPr>
+          <w:rFonts w:hint="eastAsia"/>
+        </w:rPr>
+        <w:t>claims about my data</w:t>
+      </w:r>
+      <w:r>
+        <w:rPr>
+          <w:rFonts w:hint="eastAsia"/>
+        </w:rPr>
+        <w:t>）</w:t>
+      </w:r>
+    </w:p>
+    <w:p>
+      <w:r>
+        <w:rPr>
+          <w:rFonts w:hint="eastAsia"/>
+        </w:rPr>
+        <w:t>重要的是我要现成发明一套流程为</w:t>
+      </w:r>
+      <w:r>
+        <w:rPr>
+          <w:rFonts w:hint="eastAsia"/>
+        </w:rPr>
+        <w:t>sampling</w:t>
+      </w:r>
+      <w:r>
+        <w:rPr>
+          <w:rFonts w:hint="eastAsia"/>
+        </w:rPr>
+        <w:t>服务。这是除了分析以外的</w:t>
+      </w:r>
+      <w:proofErr w:type="gramStart"/>
+      <w:r>
+        <w:rPr>
+          <w:rFonts w:hint="eastAsia"/>
+        </w:rPr>
+        <w:t>最</w:t>
+      </w:r>
+      <w:proofErr w:type="gramEnd"/>
+      <w:r>
+        <w:rPr>
+          <w:rFonts w:hint="eastAsia"/>
+        </w:rPr>
+        <w:t>关键的部分，也是最后分析能立得住的前置条件。</w:t>
+      </w:r>
+    </w:p>
+    <w:p>
+      <w:r>
+        <w:rPr>
+          <w:rFonts w:hint="eastAsia"/>
+        </w:rPr>
+        <w:t>这个过程中要结合</w:t>
+      </w:r>
+      <w:proofErr w:type="spellStart"/>
+      <w:r>
+        <w:rPr>
+          <w:rFonts w:hint="eastAsia"/>
+        </w:rPr>
+        <w:t>wiggins</w:t>
+      </w:r>
+      <w:proofErr w:type="spellEnd"/>
+      <w:r>
+        <w:rPr>
+          <w:rFonts w:hint="eastAsia"/>
+        </w:rPr>
+        <w:t>的第六章的推荐分析流程，看看是不是能结合一下。</w:t>
+      </w:r>
+    </w:p>
+    <w:p>
+      <w:pPr>
+        <w:pStyle w:val="2"/>
+      </w:pPr>
+      <w:r>
+        <w:rPr>
+          <w:rFonts w:hint="eastAsia"/>
+        </w:rPr>
+        <w:lastRenderedPageBreak/>
+        <w:t xml:space="preserve">1. </w:t>
+      </w:r>
+      <w:r>
+        <w:rPr>
+          <w:rFonts w:hint="eastAsia"/>
+        </w:rPr>
+        <w:t>Wiggins</w:t>
+      </w:r>
+      <w:r>
+        <w:rPr>
+          <w:rFonts w:hint="eastAsia"/>
+        </w:rPr>
+        <w:t>推荐的</w:t>
+      </w:r>
+      <w:r>
+        <w:rPr>
+          <w:rFonts w:hint="eastAsia"/>
+        </w:rPr>
+        <w:t>DP</w:t>
+      </w:r>
+      <w:r>
+        <w:rPr>
+          <w:rFonts w:hint="eastAsia"/>
+        </w:rPr>
+        <w:t>分析流程：</w:t>
+      </w:r>
+    </w:p>
+    <w:p>
+      <w:pPr>
+        <w:rPr>
+          <w:rStyle w:val="a7"/>
+          <w:color w:val="auto"/>
+        </w:rPr>
+      </w:pPr>
+      <w:r>
+        <w:rPr>
+          <w:rStyle w:val="a7"/>
+        </w:rPr>
+        <w:t>Sta</w:t>
+      </w:r>
+      <w:r>
+        <w:rPr>
+          <w:rStyle w:val="a7"/>
+          <w:rFonts w:hint="eastAsia"/>
+        </w:rPr>
+        <w:t xml:space="preserve">ge 1: </w:t>
+      </w:r>
+      <w:r>
+        <w:rPr>
+          <w:rStyle w:val="a7"/>
+          <w:rFonts w:hint="eastAsia"/>
+          <w:color w:val="auto"/>
+        </w:rPr>
+        <w:t>Read the data</w:t>
+      </w:r>
+    </w:p>
+    <w:p>
+      <w:pPr>
+        <w:rPr>
+          <w:rStyle w:val="a7"/>
+          <w:b w:val="0"/>
+          <w:bCs w:val="0"/>
+          <w:i w:val="0"/>
+          <w:iCs w:val="0"/>
+          <w:color w:val="auto"/>
+        </w:rPr>
+      </w:pPr>
+      <w:r>
+        <w:rPr>
+          <w:rStyle w:val="a7"/>
+          <w:rFonts w:hint="eastAsia"/>
+          <w:b w:val="0"/>
+          <w:bCs w:val="0"/>
+          <w:i w:val="0"/>
+          <w:iCs w:val="0"/>
+          <w:color w:val="auto"/>
+        </w:rPr>
+        <w:t>这个阶段主要看</w:t>
+      </w:r>
+      <w:r>
+        <w:rPr>
+          <w:rStyle w:val="a7"/>
+          <w:rFonts w:hint="eastAsia"/>
+          <w:i w:val="0"/>
+          <w:iCs w:val="0"/>
+          <w:color w:val="auto"/>
+        </w:rPr>
+        <w:t>内容</w:t>
+      </w:r>
+      <w:r>
+        <w:rPr>
+          <w:rStyle w:val="a7"/>
+          <w:rFonts w:hint="eastAsia"/>
+          <w:b w:val="0"/>
+          <w:bCs w:val="0"/>
+          <w:i w:val="0"/>
+          <w:iCs w:val="0"/>
+          <w:color w:val="auto"/>
+        </w:rPr>
+        <w:t>和</w:t>
+      </w:r>
+      <w:r>
+        <w:rPr>
+          <w:rStyle w:val="a7"/>
+          <w:rFonts w:hint="eastAsia"/>
+          <w:i w:val="0"/>
+          <w:iCs w:val="0"/>
+          <w:color w:val="auto"/>
+        </w:rPr>
+        <w:t>组织</w:t>
+      </w:r>
+      <w:r>
+        <w:rPr>
+          <w:rStyle w:val="a7"/>
+          <w:rFonts w:hint="eastAsia"/>
+          <w:b w:val="0"/>
+          <w:bCs w:val="0"/>
+          <w:i w:val="0"/>
+          <w:iCs w:val="0"/>
+          <w:color w:val="auto"/>
         </w:rPr>
         <w:t xml:space="preserve"> </w:t>
       </w:r>
       <w:r>
-        <w:t>多抽，其中选取可分析的帖子</w:t>
-      </w:r>
-      <w:r>
-        <w:rPr>
-          <w:rFonts w:hint="eastAsia"/>
-        </w:rPr>
-        <w:t>。</w:t>
-      </w:r>
-    </w:p>
-    <w:p>
-      <w:r>
-        <w:rPr>
-          <w:rFonts w:ascii="Segoe UI Symbol" w:hAnsi="Segoe UI Symbol" w:cs="Segoe UI Symbol"/>
-        </w:rPr>
-        <w:t>✔</w:t>
-      </w:r>
-      <w:r>
-        <w:rPr>
-          <w:rFonts w:ascii="Segoe UI Symbol" w:hAnsi="Segoe UI Symbol" w:cs="Segoe UI Symbol" w:hint="eastAsia"/>
+        <w:rPr>
+          <w:rStyle w:val="a7"/>
+          <w:b w:val="0"/>
+          <w:bCs w:val="0"/>
+          <w:i w:val="0"/>
+          <w:iCs w:val="0"/>
+          <w:color w:val="auto"/>
+        </w:rPr>
+        <w:t>—</w:t>
+      </w:r>
+      <w:r>
+        <w:rPr>
+          <w:rStyle w:val="a7"/>
+          <w:rFonts w:hint="eastAsia"/>
+          <w:i w:val="0"/>
+          <w:iCs w:val="0"/>
+          <w:color w:val="auto"/>
         </w:rPr>
         <w:t xml:space="preserve"> </w:t>
       </w:r>
       <w:r>
-        <w:t>写论文的时候要在显眼处声明反</w:t>
-      </w:r>
-      <w:r>
-        <w:t>cherry</w:t>
-      </w:r>
-      <w:r>
-        <w:rPr>
-          <w:rFonts w:hint="eastAsia"/>
-        </w:rPr>
-        <w:t xml:space="preserve"> </w:t>
-      </w:r>
-      <w:r>
-        <w:t>picking</w:t>
-      </w:r>
-      <w:r>
-        <w:rPr>
-          <w:rFonts w:hint="eastAsia"/>
-        </w:rPr>
-        <w:t>的思路：</w:t>
+        <w:rPr>
+          <w:rStyle w:val="a7"/>
+          <w:rFonts w:hint="eastAsia"/>
+          <w:b w:val="0"/>
+          <w:bCs w:val="0"/>
+          <w:i w:val="0"/>
+          <w:iCs w:val="0"/>
+          <w:color w:val="auto"/>
+        </w:rPr>
+        <w:t>“说了什么”，“以什么顺序说的”</w:t>
+      </w:r>
+    </w:p>
+    <w:p>
+      <w:pPr>
+        <w:rPr>
+          <w:rStyle w:val="a7"/>
+          <w:rFonts w:hint="eastAsia"/>
+          <w:b w:val="0"/>
+          <w:bCs w:val="0"/>
+          <w:i w:val="0"/>
+          <w:iCs w:val="0"/>
+          <w:color w:val="auto"/>
+        </w:rPr>
+      </w:pPr>
+      <w:r>
+        <w:rPr>
+          <w:rStyle w:val="a7"/>
+          <w:rFonts w:hint="eastAsia"/>
+          <w:b w:val="0"/>
+          <w:bCs w:val="0"/>
+          <w:i w:val="0"/>
+          <w:iCs w:val="0"/>
+          <w:color w:val="auto"/>
+        </w:rPr>
+        <w:t>作者的提示：</w:t>
       </w:r>
     </w:p>
     <w:p>
@@ -457,29 +710,28 @@
         <w:pStyle w:val="a6"/>
         <w:numPr>
           <w:ilvl w:val="0"/>
-          <w:numId w:val="16"/>
+          <w:numId w:val="17"/>
         </w:numPr>
-      </w:pPr>
-      <w:r>
-        <w:t>B</w:t>
-      </w:r>
-      <w:r>
-        <w:rPr>
-          <w:rFonts w:hint="eastAsia"/>
-        </w:rPr>
-        <w:t>atch coding</w:t>
-      </w:r>
-      <w:r>
-        <w:rPr>
-          <w:rFonts w:hint="eastAsia"/>
-        </w:rPr>
-        <w:t>本身就是为了反</w:t>
-      </w:r>
-      <w:r>
-        <w:rPr>
-          <w:rFonts w:hint="eastAsia"/>
-        </w:rPr>
-        <w:t>cherry picking</w:t>
+        <w:rPr>
+          <w:rStyle w:val="a7"/>
+          <w:b w:val="0"/>
+          <w:bCs w:val="0"/>
+          <w:i w:val="0"/>
+          <w:iCs w:val="0"/>
+          <w:color w:val="auto"/>
+        </w:rPr>
+      </w:pPr>
+      <w:r>
+        <w:rPr>
+          <w:rStyle w:val="a7"/>
+          <w:rFonts w:hint="eastAsia"/>
+          <w:b w:val="0"/>
+          <w:bCs w:val="0"/>
+          <w:i w:val="0"/>
+          <w:iCs w:val="0"/>
+          <w:color w:val="auto"/>
+        </w:rPr>
+        <w:t>假如这个阶段进行的过程中就已经开始觉得“没有什么可以分析”，这时候不要慌张，因为这种情况基本不会真的出现，即便手头的材料看起来并不是理想。</w:t>
       </w:r>
     </w:p>
     <w:p>
@@ -487,14 +739,269 @@
         <w:pStyle w:val="a6"/>
         <w:numPr>
           <w:ilvl w:val="0"/>
-          <w:numId w:val="16"/>
+          <w:numId w:val="17"/>
         </w:numPr>
-      </w:pPr>
-      <w:r>
-        <w:t xml:space="preserve">pilot 71 + spot-check 50 </w:t>
-      </w:r>
-      <w:r>
-        <w:t>不得进入</w:t>
+        <w:rPr>
+          <w:rStyle w:val="a7"/>
+          <w:b w:val="0"/>
+          <w:bCs w:val="0"/>
+          <w:i w:val="0"/>
+          <w:iCs w:val="0"/>
+          <w:color w:val="auto"/>
+        </w:rPr>
+      </w:pPr>
+      <w:r>
+        <w:rPr>
+          <w:rStyle w:val="a7"/>
+          <w:rFonts w:hint="eastAsia"/>
+          <w:b w:val="0"/>
+          <w:bCs w:val="0"/>
+          <w:i w:val="0"/>
+          <w:iCs w:val="0"/>
+          <w:color w:val="auto"/>
+        </w:rPr>
+        <w:t>不要着急找主题，这是新手常犯的问题。这时候更重要的是熟悉</w:t>
+      </w:r>
+      <w:r>
+        <w:rPr>
+          <w:rStyle w:val="a7"/>
+          <w:rFonts w:hint="eastAsia"/>
+          <w:b w:val="0"/>
+          <w:bCs w:val="0"/>
+          <w:i w:val="0"/>
+          <w:iCs w:val="0"/>
+          <w:color w:val="auto"/>
+        </w:rPr>
+        <w:t>DP</w:t>
+      </w:r>
+      <w:r>
+        <w:rPr>
+          <w:rStyle w:val="a7"/>
+          <w:rFonts w:hint="eastAsia"/>
+          <w:b w:val="0"/>
+          <w:bCs w:val="0"/>
+          <w:i w:val="0"/>
+          <w:iCs w:val="0"/>
+          <w:color w:val="auto"/>
+        </w:rPr>
+        <w:t>的</w:t>
+      </w:r>
+      <w:r>
+        <w:rPr>
+          <w:rStyle w:val="a7"/>
+          <w:rFonts w:hint="eastAsia"/>
+          <w:b w:val="0"/>
+          <w:bCs w:val="0"/>
+          <w:i w:val="0"/>
+          <w:iCs w:val="0"/>
+          <w:color w:val="auto"/>
+        </w:rPr>
+        <w:t>lens</w:t>
+      </w:r>
+      <w:r>
+        <w:rPr>
+          <w:rStyle w:val="a7"/>
+          <w:rFonts w:hint="eastAsia"/>
+          <w:b w:val="0"/>
+          <w:bCs w:val="0"/>
+          <w:i w:val="0"/>
+          <w:iCs w:val="0"/>
+          <w:color w:val="auto"/>
+        </w:rPr>
+        <w:t>。因为跟别的质性研究方法不一样，</w:t>
+      </w:r>
+      <w:r>
+        <w:rPr>
+          <w:rStyle w:val="a7"/>
+          <w:rFonts w:hint="eastAsia"/>
+          <w:b w:val="0"/>
+          <w:bCs w:val="0"/>
+          <w:i w:val="0"/>
+          <w:iCs w:val="0"/>
+          <w:color w:val="auto"/>
+        </w:rPr>
+        <w:t xml:space="preserve"> DP</w:t>
+      </w:r>
+      <w:r>
+        <w:rPr>
+          <w:rStyle w:val="a7"/>
+          <w:rFonts w:hint="eastAsia"/>
+          <w:b w:val="0"/>
+          <w:bCs w:val="0"/>
+          <w:i w:val="0"/>
+          <w:iCs w:val="0"/>
+          <w:color w:val="auto"/>
+        </w:rPr>
+        <w:t>和其他话语分析更注重</w:t>
+      </w:r>
+      <w:r>
+        <w:rPr>
+          <w:rStyle w:val="a7"/>
+          <w:rFonts w:hint="eastAsia"/>
+          <w:b w:val="0"/>
+          <w:bCs w:val="0"/>
+          <w:i w:val="0"/>
+          <w:iCs w:val="0"/>
+          <w:color w:val="auto"/>
+        </w:rPr>
+        <w:t>issue</w:t>
+      </w:r>
+      <w:r>
+        <w:rPr>
+          <w:rStyle w:val="a7"/>
+          <w:rFonts w:hint="eastAsia"/>
+          <w:b w:val="0"/>
+          <w:bCs w:val="0"/>
+          <w:i w:val="0"/>
+          <w:iCs w:val="0"/>
+          <w:color w:val="auto"/>
+        </w:rPr>
+        <w:t>和</w:t>
+      </w:r>
+      <w:r>
+        <w:rPr>
+          <w:rStyle w:val="a7"/>
+          <w:rFonts w:hint="eastAsia"/>
+          <w:b w:val="0"/>
+          <w:bCs w:val="0"/>
+          <w:i w:val="0"/>
+          <w:iCs w:val="0"/>
+          <w:color w:val="auto"/>
+        </w:rPr>
+        <w:t>social practice</w:t>
+      </w:r>
+      <w:r>
+        <w:rPr>
+          <w:rStyle w:val="a7"/>
+          <w:rFonts w:hint="eastAsia"/>
+          <w:b w:val="0"/>
+          <w:bCs w:val="0"/>
+          <w:i w:val="0"/>
+          <w:iCs w:val="0"/>
+          <w:color w:val="auto"/>
+        </w:rPr>
+        <w:t>，而不是主题。</w:t>
+      </w:r>
+    </w:p>
+    <w:p>
+      <w:pPr>
+        <w:rPr>
+          <w:rStyle w:val="a7"/>
+          <w:color w:val="auto"/>
+        </w:rPr>
+      </w:pPr>
+      <w:r>
+        <w:rPr>
+          <w:rStyle w:val="a7"/>
+        </w:rPr>
+        <w:t>Sta</w:t>
+      </w:r>
+      <w:r>
+        <w:rPr>
+          <w:rStyle w:val="a7"/>
+          <w:rFonts w:hint="eastAsia"/>
+        </w:rPr>
+        <w:t xml:space="preserve">ge </w:t>
+      </w:r>
+      <w:r>
+        <w:rPr>
+          <w:rStyle w:val="a7"/>
+          <w:rFonts w:hint="eastAsia"/>
+        </w:rPr>
+        <w:t>2</w:t>
+      </w:r>
+      <w:r>
+        <w:rPr>
+          <w:rStyle w:val="a7"/>
+          <w:rFonts w:hint="eastAsia"/>
+        </w:rPr>
+        <w:t xml:space="preserve">: </w:t>
+      </w:r>
+      <w:r>
+        <w:rPr>
+          <w:rStyle w:val="a7"/>
+          <w:rFonts w:hint="eastAsia"/>
+          <w:color w:val="auto"/>
+        </w:rPr>
+        <w:t>Describe</w:t>
+      </w:r>
+      <w:r>
+        <w:rPr>
+          <w:rStyle w:val="a7"/>
+          <w:rFonts w:hint="eastAsia"/>
+          <w:color w:val="auto"/>
+        </w:rPr>
+        <w:t xml:space="preserve"> the data</w:t>
+      </w:r>
+    </w:p>
+    <w:p>
+      <w:pPr>
+        <w:rPr>
+          <w:rStyle w:val="a7"/>
+          <w:b w:val="0"/>
+          <w:bCs w:val="0"/>
+          <w:i w:val="0"/>
+          <w:iCs w:val="0"/>
+          <w:color w:val="auto"/>
+        </w:rPr>
+      </w:pPr>
+      <w:r>
+        <w:rPr>
+          <w:rStyle w:val="a7"/>
+          <w:rFonts w:hint="eastAsia"/>
+          <w:b w:val="0"/>
+          <w:bCs w:val="0"/>
+          <w:i w:val="0"/>
+          <w:iCs w:val="0"/>
+          <w:color w:val="auto"/>
+        </w:rPr>
+        <w:t>这个阶段</w:t>
+      </w:r>
+      <w:r>
+        <w:rPr>
+          <w:rStyle w:val="a7"/>
+          <w:rFonts w:hint="eastAsia"/>
+          <w:b w:val="0"/>
+          <w:bCs w:val="0"/>
+          <w:i w:val="0"/>
+          <w:iCs w:val="0"/>
+          <w:color w:val="auto"/>
+        </w:rPr>
+        <w:t>开始做笔记。第一阶段的存在允许我们在第二阶段验证我们在第一段时期的想法。第二阶段的存在又可以帮助我们避免对文本做过度假设。</w:t>
+      </w:r>
+    </w:p>
+    <w:p>
+      <w:pPr>
+        <w:rPr>
+          <w:rStyle w:val="a7"/>
+          <w:b w:val="0"/>
+          <w:bCs w:val="0"/>
+          <w:i w:val="0"/>
+          <w:iCs w:val="0"/>
+          <w:color w:val="auto"/>
+        </w:rPr>
+      </w:pPr>
+      <w:r>
+        <w:rPr>
+          <w:rStyle w:val="a7"/>
+          <w:rFonts w:hint="eastAsia"/>
+          <w:i w:val="0"/>
+          <w:iCs w:val="0"/>
+          <w:color w:val="auto"/>
+        </w:rPr>
+        <w:t>这个阶段的重点是看文本里真实发生的事情，避免开始着急解释</w:t>
+      </w:r>
+      <w:r>
+        <w:rPr>
+          <w:rStyle w:val="a7"/>
+          <w:rFonts w:hint="eastAsia"/>
+          <w:b w:val="0"/>
+          <w:bCs w:val="0"/>
+          <w:i w:val="0"/>
+          <w:iCs w:val="0"/>
+          <w:color w:val="auto"/>
+        </w:rPr>
+        <w:t>。</w:t>
       </w:r>
     </w:p>
     <w:p>
@@ -502,75 +1009,2692 @@
         <w:pStyle w:val="a6"/>
         <w:numPr>
           <w:ilvl w:val="0"/>
-          <w:numId w:val="16"/>
+          <w:numId w:val="17"/>
         </w:numPr>
         <w:rPr>
-          <w:rFonts w:hint="eastAsia"/>
-        </w:rPr>
-      </w:pPr>
-      <w:r>
-        <w:rPr>
-          <w:rFonts w:hint="eastAsia"/>
-        </w:rPr>
-        <w:t xml:space="preserve">63 </w:t>
-      </w:r>
-      <w:r>
-        <w:rPr>
-          <w:rFonts w:hint="eastAsia"/>
-        </w:rPr>
-        <w:t>→</w:t>
-      </w:r>
-      <w:r>
-        <w:rPr>
-          <w:rFonts w:hint="eastAsia"/>
-        </w:rPr>
-        <w:t xml:space="preserve">35 </w:t>
-      </w:r>
-      <w:r>
-        <w:rPr>
-          <w:rFonts w:hint="eastAsia"/>
-        </w:rPr>
-        <w:t>±</w:t>
-      </w:r>
-      <w:r>
-        <w:rPr>
-          <w:rFonts w:hint="eastAsia"/>
-        </w:rPr>
-        <w:t xml:space="preserve"> 5: </w:t>
-      </w:r>
-      <w:r>
-        <w:t>读的过程中发现格子跟预想不符</w:t>
-      </w:r>
-      <w:r>
-        <w:t>,</w:t>
-      </w:r>
-      <w:r>
-        <w:t>可以调</w:t>
-      </w:r>
-      <w:r>
-        <w:t>,</w:t>
-      </w:r>
-      <w:r>
-        <w:t>调了记下来</w:t>
-      </w:r>
-    </w:p>
-    <w:p>
-      <w:pPr>
-        <w:rPr>
-          <w:rStyle w:val="a7"/>
-          <w:rFonts w:hint="eastAsia"/>
-        </w:rPr>
-      </w:pPr>
+          <w:rStyle w:val="a7"/>
+          <w:b w:val="0"/>
+          <w:bCs w:val="0"/>
+          <w:i w:val="0"/>
+          <w:iCs w:val="0"/>
+          <w:color w:val="auto"/>
+        </w:rPr>
+      </w:pPr>
+      <w:r>
+        <w:rPr>
+          <w:rStyle w:val="a7"/>
+          <w:b w:val="0"/>
+          <w:bCs w:val="0"/>
+          <w:i w:val="0"/>
+          <w:iCs w:val="0"/>
+          <w:color w:val="auto"/>
+        </w:rPr>
+        <w:t>W</w:t>
+      </w:r>
+      <w:r>
+        <w:rPr>
+          <w:rStyle w:val="a7"/>
+          <w:rFonts w:hint="eastAsia"/>
+          <w:b w:val="0"/>
+          <w:bCs w:val="0"/>
+          <w:i w:val="0"/>
+          <w:iCs w:val="0"/>
+          <w:color w:val="auto"/>
+        </w:rPr>
+        <w:t>hat</w:t>
+      </w:r>
+      <w:r>
+        <w:rPr>
+          <w:rStyle w:val="a7"/>
+          <w:rFonts w:hint="eastAsia"/>
+          <w:b w:val="0"/>
+          <w:bCs w:val="0"/>
+          <w:i w:val="0"/>
+          <w:iCs w:val="0"/>
+          <w:color w:val="auto"/>
+        </w:rPr>
+        <w:t>：</w:t>
+      </w:r>
+      <w:r>
+        <w:rPr>
+          <w:rStyle w:val="a7"/>
+          <w:rFonts w:hint="eastAsia"/>
+          <w:b w:val="0"/>
+          <w:bCs w:val="0"/>
+          <w:i w:val="0"/>
+          <w:iCs w:val="0"/>
+          <w:color w:val="auto"/>
+        </w:rPr>
+        <w:t>用了什么词，这个词的性质，用的是什么列别，普通的词还是群体特有的表达，用什么类别称呼人或事物（</w:t>
+      </w:r>
+      <w:r>
+        <w:t>focus on the content of the discourse and on what is being constructed</w:t>
+      </w:r>
+      <w:r>
+        <w:rPr>
+          <w:rStyle w:val="a7"/>
+          <w:rFonts w:hint="eastAsia"/>
+          <w:b w:val="0"/>
+          <w:bCs w:val="0"/>
+          <w:i w:val="0"/>
+          <w:iCs w:val="0"/>
+          <w:color w:val="auto"/>
+        </w:rPr>
+        <w:t>）</w:t>
+      </w:r>
+    </w:p>
+    <w:p>
+      <w:pPr>
+        <w:pStyle w:val="a6"/>
+        <w:numPr>
+          <w:ilvl w:val="0"/>
+          <w:numId w:val="17"/>
+        </w:numPr>
+        <w:rPr>
+          <w:rStyle w:val="a7"/>
+          <w:b w:val="0"/>
+          <w:bCs w:val="0"/>
+          <w:i w:val="0"/>
+          <w:iCs w:val="0"/>
+          <w:color w:val="auto"/>
+        </w:rPr>
+      </w:pPr>
+      <w:r>
+        <w:rPr>
+          <w:rStyle w:val="a7"/>
+          <w:b w:val="0"/>
+          <w:bCs w:val="0"/>
+          <w:i w:val="0"/>
+          <w:iCs w:val="0"/>
+          <w:color w:val="auto"/>
+        </w:rPr>
+        <w:t>H</w:t>
+      </w:r>
+      <w:r>
+        <w:rPr>
+          <w:rStyle w:val="a7"/>
+          <w:rFonts w:hint="eastAsia"/>
+          <w:b w:val="0"/>
+          <w:bCs w:val="0"/>
+          <w:i w:val="0"/>
+          <w:iCs w:val="0"/>
+          <w:color w:val="auto"/>
+        </w:rPr>
+        <w:t>ow</w:t>
+      </w:r>
+      <w:r>
+        <w:rPr>
+          <w:rStyle w:val="a7"/>
+          <w:rFonts w:hint="eastAsia"/>
+          <w:b w:val="0"/>
+          <w:bCs w:val="0"/>
+          <w:i w:val="0"/>
+          <w:iCs w:val="0"/>
+          <w:color w:val="auto"/>
+        </w:rPr>
+        <w:t>：怎么说的，是不是用了大写、</w:t>
+      </w:r>
+      <w:r>
+        <w:rPr>
+          <w:rStyle w:val="a7"/>
+          <w:rFonts w:hint="eastAsia"/>
+          <w:b w:val="0"/>
+          <w:bCs w:val="0"/>
+          <w:i w:val="0"/>
+          <w:iCs w:val="0"/>
+          <w:color w:val="auto"/>
+        </w:rPr>
+        <w:t>emoji</w:t>
+      </w:r>
+      <w:r>
+        <w:rPr>
+          <w:rStyle w:val="a7"/>
+          <w:rFonts w:hint="eastAsia"/>
+          <w:b w:val="0"/>
+          <w:bCs w:val="0"/>
+          <w:i w:val="0"/>
+          <w:iCs w:val="0"/>
+          <w:color w:val="auto"/>
+        </w:rPr>
+        <w:t>（</w:t>
+      </w:r>
+      <w:r>
+        <w:t>This focuses us on the style or structure of the discourse, on how the talk is constructed</w:t>
+      </w:r>
+      <w:r>
+        <w:rPr>
+          <w:rStyle w:val="a7"/>
+          <w:rFonts w:hint="eastAsia"/>
+          <w:b w:val="0"/>
+          <w:bCs w:val="0"/>
+          <w:i w:val="0"/>
+          <w:iCs w:val="0"/>
+          <w:color w:val="auto"/>
+        </w:rPr>
+        <w:t>）</w:t>
+      </w:r>
+    </w:p>
+    <w:p>
+      <w:pPr>
+        <w:pStyle w:val="a6"/>
+        <w:numPr>
+          <w:ilvl w:val="0"/>
+          <w:numId w:val="17"/>
+        </w:numPr>
+        <w:rPr>
+          <w:rStyle w:val="a7"/>
+          <w:b w:val="0"/>
+          <w:bCs w:val="0"/>
+          <w:i w:val="0"/>
+          <w:iCs w:val="0"/>
+          <w:color w:val="auto"/>
+        </w:rPr>
+      </w:pPr>
+      <w:r>
+        <w:rPr>
+          <w:rStyle w:val="a7"/>
+          <w:rFonts w:hint="eastAsia"/>
+          <w:b w:val="0"/>
+          <w:bCs w:val="0"/>
+          <w:i w:val="0"/>
+          <w:iCs w:val="0"/>
+          <w:color w:val="auto"/>
+        </w:rPr>
+        <w:t>When</w:t>
+      </w:r>
+      <w:r>
+        <w:rPr>
+          <w:rStyle w:val="a7"/>
+          <w:rFonts w:hint="eastAsia"/>
+          <w:b w:val="0"/>
+          <w:bCs w:val="0"/>
+          <w:i w:val="0"/>
+          <w:iCs w:val="0"/>
+          <w:color w:val="auto"/>
+        </w:rPr>
+        <w:t>：出现的位置是什么（</w:t>
+      </w:r>
+      <w:r>
+        <w:t>This focuses us on the organi</w:t>
+      </w:r>
+      <w:r>
+        <w:rPr>
+          <w:rFonts w:hint="eastAsia"/>
+        </w:rPr>
+        <w:t>z</w:t>
+      </w:r>
+      <w:r>
+        <w:t>ation and situatedness of the discourse</w:t>
+      </w:r>
+      <w:r>
+        <w:rPr>
+          <w:rStyle w:val="a7"/>
+          <w:rFonts w:hint="eastAsia"/>
+          <w:b w:val="0"/>
+          <w:bCs w:val="0"/>
+          <w:i w:val="0"/>
+          <w:iCs w:val="0"/>
+          <w:color w:val="auto"/>
+        </w:rPr>
+        <w:t>）</w:t>
+      </w:r>
+    </w:p>
+    <w:p>
+      <w:pPr>
+        <w:rPr>
+          <w:rStyle w:val="a7"/>
+          <w:b w:val="0"/>
+          <w:bCs w:val="0"/>
+          <w:i w:val="0"/>
+          <w:iCs w:val="0"/>
+          <w:color w:val="auto"/>
+        </w:rPr>
+      </w:pPr>
+      <w:r>
+        <w:rPr>
+          <w:rStyle w:val="a7"/>
+          <w:rFonts w:hint="eastAsia"/>
+          <w:b w:val="0"/>
+          <w:bCs w:val="0"/>
+          <w:i w:val="0"/>
+          <w:iCs w:val="0"/>
+          <w:color w:val="auto"/>
+        </w:rPr>
+        <w:t>作者提示：</w:t>
+      </w:r>
+    </w:p>
+    <w:p>
+      <w:pPr>
+        <w:pStyle w:val="a6"/>
+        <w:numPr>
+          <w:ilvl w:val="0"/>
+          <w:numId w:val="17"/>
+        </w:numPr>
+        <w:rPr>
+          <w:rStyle w:val="a7"/>
+          <w:b w:val="0"/>
+          <w:bCs w:val="0"/>
+          <w:i w:val="0"/>
+          <w:iCs w:val="0"/>
+          <w:color w:val="auto"/>
+        </w:rPr>
+      </w:pPr>
+      <w:r>
+        <w:rPr>
+          <w:rStyle w:val="a7"/>
+          <w:rFonts w:hint="eastAsia"/>
+          <w:b w:val="0"/>
+          <w:bCs w:val="0"/>
+          <w:i w:val="0"/>
+          <w:iCs w:val="0"/>
+          <w:color w:val="auto"/>
+        </w:rPr>
+        <w:t>这个阶段不用逐字逐句计较，但可能会需要来回倒好几遍</w:t>
+      </w:r>
+    </w:p>
+    <w:p>
+      <w:pPr>
+        <w:pStyle w:val="a6"/>
+        <w:numPr>
+          <w:ilvl w:val="0"/>
+          <w:numId w:val="17"/>
+        </w:numPr>
+        <w:rPr>
+          <w:rStyle w:val="a7"/>
+          <w:b w:val="0"/>
+          <w:bCs w:val="0"/>
+          <w:i w:val="0"/>
+          <w:iCs w:val="0"/>
+          <w:color w:val="auto"/>
+        </w:rPr>
+      </w:pPr>
+      <w:r>
+        <w:rPr>
+          <w:rStyle w:val="a7"/>
+          <w:rFonts w:hint="eastAsia"/>
+          <w:b w:val="0"/>
+          <w:bCs w:val="0"/>
+          <w:i w:val="0"/>
+          <w:iCs w:val="0"/>
+          <w:color w:val="auto"/>
+        </w:rPr>
+        <w:t>新手常犯开始分析</w:t>
+      </w:r>
+      <w:r>
+        <w:rPr>
+          <w:rStyle w:val="a7"/>
+          <w:rFonts w:hint="eastAsia"/>
+          <w:b w:val="0"/>
+          <w:bCs w:val="0"/>
+          <w:i w:val="0"/>
+          <w:iCs w:val="0"/>
+          <w:color w:val="auto"/>
+        </w:rPr>
+        <w:t>why</w:t>
+      </w:r>
+      <w:r>
+        <w:rPr>
+          <w:rStyle w:val="a7"/>
+          <w:rFonts w:hint="eastAsia"/>
+          <w:b w:val="0"/>
+          <w:bCs w:val="0"/>
+          <w:i w:val="0"/>
+          <w:iCs w:val="0"/>
+          <w:color w:val="auto"/>
+        </w:rPr>
+        <w:t>的错误</w:t>
+      </w:r>
+    </w:p>
+    <w:p>
+      <w:pPr>
+        <w:pStyle w:val="a6"/>
+        <w:numPr>
+          <w:ilvl w:val="0"/>
+          <w:numId w:val="17"/>
+        </w:numPr>
+        <w:rPr>
+          <w:rStyle w:val="a7"/>
+          <w:b w:val="0"/>
+          <w:bCs w:val="0"/>
+          <w:i w:val="0"/>
+          <w:iCs w:val="0"/>
+          <w:color w:val="auto"/>
+        </w:rPr>
+      </w:pPr>
+      <w:r>
+        <w:rPr>
+          <w:rStyle w:val="a7"/>
+          <w:rFonts w:hint="eastAsia"/>
+          <w:b w:val="0"/>
+          <w:bCs w:val="0"/>
+          <w:i w:val="0"/>
+          <w:iCs w:val="0"/>
+          <w:color w:val="auto"/>
+        </w:rPr>
+        <w:t>开始分析认知和情感状态的时候立刻停下来，但是不要因此沮丧，因为引起你的反应的部分往往很重要</w:t>
+      </w:r>
+    </w:p>
+    <w:p>
+      <w:pPr>
+        <w:rPr>
+          <w:rStyle w:val="a7"/>
+        </w:rPr>
+      </w:pPr>
+      <w:r>
+        <w:rPr>
+          <w:rStyle w:val="a7"/>
+        </w:rPr>
+        <w:t xml:space="preserve">Stage 3: </w:t>
+      </w:r>
+      <w:r>
+        <w:rPr>
+          <w:rStyle w:val="a7"/>
+          <w:color w:val="auto"/>
+        </w:rPr>
+        <w:t>Identify social actions and psychological constructs</w:t>
+      </w:r>
+    </w:p>
+    <w:p>
+      <w:pPr>
+        <w:rPr>
+          <w:rStyle w:val="a7"/>
+          <w:b w:val="0"/>
+          <w:bCs w:val="0"/>
+          <w:i w:val="0"/>
+          <w:iCs w:val="0"/>
+          <w:color w:val="auto"/>
+        </w:rPr>
+      </w:pPr>
+      <w:r>
+        <w:rPr>
+          <w:rStyle w:val="a7"/>
+          <w:rFonts w:hint="eastAsia"/>
+          <w:b w:val="0"/>
+          <w:bCs w:val="0"/>
+          <w:i w:val="0"/>
+          <w:iCs w:val="0"/>
+          <w:color w:val="auto"/>
+        </w:rPr>
+        <w:t>这个阶段展示达成了什么样的社会行为、怎么达成的、通过这些社会行为如何用来管理心理事务。</w:t>
+      </w:r>
+    </w:p>
+    <w:p>
+      <w:pPr>
+        <w:rPr>
+          <w:rStyle w:val="a7"/>
+          <w:i w:val="0"/>
+          <w:iCs w:val="0"/>
+          <w:color w:val="auto"/>
+        </w:rPr>
+      </w:pPr>
+      <w:r>
+        <w:rPr>
+          <w:rStyle w:val="a7"/>
+          <w:rFonts w:hint="eastAsia"/>
+          <w:i w:val="0"/>
+          <w:iCs w:val="0"/>
+          <w:color w:val="auto"/>
+        </w:rPr>
+        <w:t>Social action</w:t>
+      </w:r>
+    </w:p>
+    <w:p>
+      <w:pPr>
+        <w:rPr>
+          <w:rStyle w:val="a7"/>
+          <w:b w:val="0"/>
+          <w:bCs w:val="0"/>
+          <w:i w:val="0"/>
+          <w:iCs w:val="0"/>
+          <w:color w:val="auto"/>
+        </w:rPr>
+      </w:pPr>
+      <w:r>
+        <w:rPr>
+          <w:rStyle w:val="a7"/>
+          <w:rFonts w:hint="eastAsia"/>
+          <w:b w:val="0"/>
+          <w:bCs w:val="0"/>
+          <w:i w:val="0"/>
+          <w:iCs w:val="0"/>
+          <w:color w:val="auto"/>
+        </w:rPr>
+        <w:t>人们说话的时候从来不是只是说话，一定还会在互动</w:t>
+      </w:r>
+      <w:proofErr w:type="gramStart"/>
+      <w:r>
+        <w:rPr>
+          <w:rStyle w:val="a7"/>
+          <w:rFonts w:hint="eastAsia"/>
+          <w:b w:val="0"/>
+          <w:bCs w:val="0"/>
+          <w:i w:val="0"/>
+          <w:iCs w:val="0"/>
+          <w:color w:val="auto"/>
+        </w:rPr>
+        <w:t>做别</w:t>
+      </w:r>
+      <w:proofErr w:type="gramEnd"/>
+      <w:r>
+        <w:rPr>
+          <w:rStyle w:val="a7"/>
+          <w:rFonts w:hint="eastAsia"/>
+          <w:b w:val="0"/>
+          <w:bCs w:val="0"/>
+          <w:i w:val="0"/>
+          <w:iCs w:val="0"/>
+          <w:color w:val="auto"/>
+        </w:rPr>
+        <w:t>的事情。</w:t>
+      </w:r>
+    </w:p>
+    <w:p>
+      <w:pPr>
+        <w:rPr>
+          <w:rStyle w:val="a7"/>
+          <w:b w:val="0"/>
+          <w:bCs w:val="0"/>
+          <w:i w:val="0"/>
+          <w:iCs w:val="0"/>
+          <w:color w:val="auto"/>
+        </w:rPr>
+      </w:pPr>
+      <w:r>
+        <w:rPr>
+          <w:rStyle w:val="a7"/>
+          <w:rFonts w:hint="eastAsia"/>
+          <w:b w:val="0"/>
+          <w:bCs w:val="0"/>
+          <w:i w:val="0"/>
+          <w:iCs w:val="0"/>
+          <w:color w:val="auto"/>
+        </w:rPr>
+        <w:t>字面内容和社会行动从来不是一回事，依据简单的“我很冷”在不同的情境里可能完成不同社会行动。</w:t>
+      </w:r>
+    </w:p>
+    <w:p>
+      <w:pPr>
+        <w:rPr>
+          <w:rStyle w:val="af0"/>
+        </w:rPr>
+      </w:pPr>
+      <w:r>
+        <w:rPr>
+          <w:rStyle w:val="af0"/>
+        </w:rPr>
+        <w:t>Social</w:t>
+      </w:r>
+      <w:r>
+        <w:rPr>
+          <w:rStyle w:val="af0"/>
+          <w:rFonts w:hint="eastAsia"/>
+        </w:rPr>
+        <w:t xml:space="preserve"> </w:t>
+      </w:r>
+      <w:r>
+        <w:rPr>
+          <w:rStyle w:val="af0"/>
+        </w:rPr>
+        <w:t>action</w:t>
+      </w:r>
+      <w:r>
+        <w:rPr>
+          <w:rStyle w:val="af0"/>
+        </w:rPr>
+        <w:t>是强语境化的</w:t>
+      </w:r>
+      <w:r>
+        <w:rPr>
+          <w:rStyle w:val="af0"/>
+          <w:rFonts w:hint="eastAsia"/>
+        </w:rPr>
+        <w:t>。</w:t>
+      </w:r>
+      <w:r>
+        <w:rPr>
+          <w:rStyle w:val="af0"/>
+          <w:rFonts w:hint="eastAsia"/>
+        </w:rPr>
+        <w:t>文本离开了</w:t>
+      </w:r>
+      <w:r>
+        <w:rPr>
+          <w:rStyle w:val="af0"/>
+          <w:rFonts w:hint="eastAsia"/>
+        </w:rPr>
+        <w:t>context</w:t>
+      </w:r>
+      <w:r>
+        <w:rPr>
+          <w:rStyle w:val="af0"/>
+          <w:rFonts w:hint="eastAsia"/>
+        </w:rPr>
+        <w:t>就不再是社会行为</w:t>
+      </w:r>
+    </w:p>
+    <w:p>
+      <w:pPr>
+        <w:pStyle w:val="a6"/>
+        <w:numPr>
+          <w:ilvl w:val="0"/>
+          <w:numId w:val="17"/>
+        </w:numPr>
+        <w:rPr>
+          <w:rStyle w:val="af0"/>
+        </w:rPr>
+      </w:pPr>
+      <w:r>
+        <w:rPr>
+          <w:rStyle w:val="af0"/>
+          <w:rFonts w:hint="eastAsia"/>
+        </w:rPr>
+        <w:lastRenderedPageBreak/>
+        <w:t>这里澄清的误解：</w:t>
+      </w:r>
+      <w:r>
+        <w:rPr>
+          <w:rStyle w:val="af0"/>
+          <w:rFonts w:hint="eastAsia"/>
+        </w:rPr>
+        <w:t xml:space="preserve">social </w:t>
+      </w:r>
+      <w:r>
+        <w:rPr>
+          <w:rStyle w:val="af0"/>
+        </w:rPr>
+        <w:t>action</w:t>
+      </w:r>
+      <w:r>
+        <w:rPr>
+          <w:rStyle w:val="af0"/>
+        </w:rPr>
+        <w:t>容易被误解为</w:t>
+      </w:r>
+      <w:r>
+        <w:rPr>
+          <w:rStyle w:val="af0"/>
+        </w:rPr>
+        <w:t>function</w:t>
+      </w:r>
+      <w:r>
+        <w:rPr>
+          <w:rStyle w:val="af0"/>
+          <w:rFonts w:hint="eastAsia"/>
+        </w:rPr>
+        <w:t>。</w:t>
+      </w:r>
+      <w:r>
+        <w:rPr>
+          <w:rStyle w:val="af0"/>
+        </w:rPr>
+        <w:t>其实不是的，因为</w:t>
+      </w:r>
+      <w:r>
+        <w:rPr>
+          <w:rStyle w:val="af0"/>
+          <w:rFonts w:hint="eastAsia"/>
+        </w:rPr>
+        <w:t>话语作为社会行并不是出现</w:t>
+      </w:r>
+      <w:r>
+        <w:rPr>
+          <w:rStyle w:val="af0"/>
+          <w:rFonts w:hint="eastAsia"/>
+        </w:rPr>
+        <w:t>but</w:t>
+      </w:r>
+      <w:r>
+        <w:rPr>
+          <w:rStyle w:val="af0"/>
+          <w:rFonts w:hint="eastAsia"/>
+        </w:rPr>
+        <w:t>就直接推断为辩护行为，因为</w:t>
+      </w:r>
+      <w:r>
+        <w:rPr>
+          <w:rStyle w:val="af0"/>
+        </w:rPr>
+        <w:t>B</w:t>
+      </w:r>
+      <w:r>
+        <w:rPr>
+          <w:rStyle w:val="af0"/>
+          <w:rFonts w:hint="eastAsia"/>
+        </w:rPr>
+        <w:t>ut</w:t>
+      </w:r>
+      <w:r>
+        <w:rPr>
+          <w:rStyle w:val="af0"/>
+          <w:rFonts w:hint="eastAsia"/>
+        </w:rPr>
+        <w:t>在不同的语境下有不同的用途。</w:t>
+      </w:r>
+    </w:p>
+    <w:p>
+      <w:pPr>
+        <w:rPr>
+          <w:rStyle w:val="af0"/>
+        </w:rPr>
+      </w:pPr>
+      <w:r>
+        <w:rPr>
+          <w:rStyle w:val="af0"/>
+        </w:rPr>
+        <w:t>社会行为</w:t>
+      </w:r>
+      <w:r>
+        <w:rPr>
+          <w:rStyle w:val="af0"/>
+          <w:rFonts w:hint="eastAsia"/>
+        </w:rPr>
+        <w:t>不是有一个单词决定，而是</w:t>
+      </w:r>
+      <w:proofErr w:type="gramStart"/>
+      <w:r>
+        <w:rPr>
+          <w:rStyle w:val="af0"/>
+          <w:rFonts w:hint="eastAsia"/>
+        </w:rPr>
+        <w:t>一</w:t>
+      </w:r>
+      <w:proofErr w:type="gramEnd"/>
+      <w:r>
+        <w:rPr>
+          <w:rStyle w:val="af0"/>
+          <w:rFonts w:hint="eastAsia"/>
+        </w:rPr>
+        <w:t>串语言共同完成，常常跨越多个轮次才形成</w:t>
+      </w:r>
+    </w:p>
+    <w:p>
+      <w:pPr>
+        <w:pStyle w:val="a6"/>
+        <w:numPr>
+          <w:ilvl w:val="0"/>
+          <w:numId w:val="17"/>
+        </w:numPr>
+        <w:rPr>
+          <w:rStyle w:val="af0"/>
+        </w:rPr>
+      </w:pPr>
+      <w:r>
+        <w:rPr>
+          <w:rStyle w:val="af0"/>
+          <w:rFonts w:hint="eastAsia"/>
+        </w:rPr>
+        <w:t>Reddit</w:t>
+      </w:r>
+      <w:r>
+        <w:rPr>
+          <w:rStyle w:val="af0"/>
+          <w:rFonts w:hint="eastAsia"/>
+        </w:rPr>
+        <w:t>帖子不是实时对话，但是内部其实也有顺序和互动背景</w:t>
+      </w:r>
+    </w:p>
+    <w:p>
+      <w:pPr>
+        <w:rPr>
+          <w:rStyle w:val="af0"/>
+          <w:i w:val="0"/>
+          <w:iCs w:val="0"/>
+        </w:rPr>
+      </w:pPr>
+      <w:r>
+        <w:rPr>
+          <w:rStyle w:val="af0"/>
+          <w:rFonts w:hint="eastAsia"/>
+          <w:i w:val="0"/>
+          <w:iCs w:val="0"/>
+        </w:rPr>
+        <w:t>采取“作者取向”，不要被自己的概念干扰</w:t>
+      </w:r>
+    </w:p>
+    <w:p>
+      <w:pPr>
+        <w:rPr>
+          <w:rStyle w:val="af0"/>
+          <w:b/>
+          <w:bCs/>
+          <w:i w:val="0"/>
+          <w:iCs w:val="0"/>
+          <w:color w:val="auto"/>
+        </w:rPr>
+      </w:pPr>
+      <w:r>
+        <w:rPr>
+          <w:rStyle w:val="af0"/>
+          <w:b/>
+          <w:bCs/>
+          <w:i w:val="0"/>
+          <w:iCs w:val="0"/>
+          <w:color w:val="auto"/>
+        </w:rPr>
+        <w:t>D</w:t>
+      </w:r>
+      <w:r>
+        <w:rPr>
+          <w:rStyle w:val="af0"/>
+          <w:rFonts w:hint="eastAsia"/>
+          <w:b/>
+          <w:bCs/>
+          <w:i w:val="0"/>
+          <w:iCs w:val="0"/>
+          <w:color w:val="auto"/>
+        </w:rPr>
+        <w:t>iscursive devices</w:t>
+      </w:r>
+    </w:p>
+    <w:p>
+      <w:pPr>
+        <w:rPr>
+          <w:rStyle w:val="af0"/>
+          <w:i w:val="0"/>
+          <w:iCs w:val="0"/>
+          <w:color w:val="auto"/>
+        </w:rPr>
+      </w:pPr>
+      <w:r>
+        <w:rPr>
+          <w:rStyle w:val="af0"/>
+          <w:rFonts w:hint="eastAsia"/>
+          <w:i w:val="0"/>
+          <w:iCs w:val="0"/>
+          <w:color w:val="auto"/>
+        </w:rPr>
+        <w:t>是跨互动</w:t>
+      </w:r>
+      <w:r>
+        <w:rPr>
+          <w:rStyle w:val="af0"/>
+          <w:rFonts w:hint="eastAsia"/>
+          <w:i w:val="0"/>
+          <w:iCs w:val="0"/>
+          <w:color w:val="auto"/>
+        </w:rPr>
+        <w:t>context</w:t>
+      </w:r>
+      <w:r>
+        <w:rPr>
+          <w:rStyle w:val="af0"/>
+          <w:rFonts w:hint="eastAsia"/>
+          <w:i w:val="0"/>
+          <w:iCs w:val="0"/>
+          <w:color w:val="auto"/>
+        </w:rPr>
+        <w:t>出现的、可识别的说话方式</w:t>
+      </w:r>
+    </w:p>
+    <w:p>
+      <w:pPr>
+        <w:rPr>
+          <w:rStyle w:val="af0"/>
+          <w:i w:val="0"/>
+          <w:iCs w:val="0"/>
+          <w:color w:val="auto"/>
+        </w:rPr>
+      </w:pPr>
+      <w:r>
+        <w:rPr>
+          <w:rStyle w:val="af0"/>
+          <w:rFonts w:hint="eastAsia"/>
+          <w:i w:val="0"/>
+          <w:iCs w:val="0"/>
+          <w:color w:val="auto"/>
+        </w:rPr>
+        <w:t>作者提示：</w:t>
+      </w:r>
+    </w:p>
+    <w:p>
+      <w:pPr>
+        <w:pStyle w:val="a6"/>
+        <w:numPr>
+          <w:ilvl w:val="0"/>
+          <w:numId w:val="17"/>
+        </w:numPr>
+        <w:rPr>
+          <w:rStyle w:val="af0"/>
+          <w:i w:val="0"/>
+          <w:iCs w:val="0"/>
+          <w:color w:val="auto"/>
+        </w:rPr>
+      </w:pPr>
+      <w:r>
+        <w:rPr>
+          <w:rStyle w:val="af0"/>
+          <w:rFonts w:hint="eastAsia"/>
+          <w:i w:val="0"/>
+          <w:iCs w:val="0"/>
+          <w:color w:val="auto"/>
+        </w:rPr>
+        <w:t>不要把分析做成流水式的装置点名，而是要说明这些装置为什么出现，在什么位置，共同做成了什么事情</w:t>
+      </w:r>
+    </w:p>
+    <w:p>
+      <w:pPr>
+        <w:rPr>
+          <w:rStyle w:val="a7"/>
+          <w:color w:val="auto"/>
+        </w:rPr>
+      </w:pPr>
+      <w:r>
+        <w:rPr>
+          <w:rStyle w:val="a7"/>
+        </w:rPr>
+        <w:t xml:space="preserve">Stage 4: </w:t>
+      </w:r>
+      <w:r>
+        <w:rPr>
+          <w:rStyle w:val="a7"/>
+          <w:color w:val="auto"/>
+        </w:rPr>
+        <w:t>Focus on a specific analytical issue</w:t>
+      </w:r>
+    </w:p>
+    <w:p>
+      <w:pPr>
+        <w:rPr>
+          <w:rStyle w:val="a7"/>
+          <w:b w:val="0"/>
+          <w:bCs w:val="0"/>
+          <w:i w:val="0"/>
+          <w:iCs w:val="0"/>
+          <w:color w:val="auto"/>
+        </w:rPr>
+      </w:pPr>
+      <w:r>
+        <w:rPr>
+          <w:rStyle w:val="a7"/>
+          <w:rFonts w:hint="eastAsia"/>
+          <w:b w:val="0"/>
+          <w:bCs w:val="0"/>
+          <w:i w:val="0"/>
+          <w:iCs w:val="0"/>
+          <w:color w:val="auto"/>
+        </w:rPr>
+        <w:t>开始聚焦具体的分析议题</w:t>
+      </w:r>
+    </w:p>
+    <w:p>
+      <w:pPr>
+        <w:rPr>
+          <w:rStyle w:val="a7"/>
+          <w:b w:val="0"/>
+          <w:bCs w:val="0"/>
+          <w:i w:val="0"/>
+          <w:iCs w:val="0"/>
+          <w:color w:val="auto"/>
+        </w:rPr>
+      </w:pPr>
+      <w:r>
+        <w:rPr>
+          <w:rStyle w:val="a7"/>
+          <w:rFonts w:hint="eastAsia"/>
+          <w:b w:val="0"/>
+          <w:bCs w:val="0"/>
+          <w:i w:val="0"/>
+          <w:iCs w:val="0"/>
+          <w:color w:val="auto"/>
+        </w:rPr>
+        <w:t>这个阶段研究问题可能会有些转变和添加（我觉得我的基本已经定下来了，不会再多了）</w:t>
+      </w:r>
+    </w:p>
+    <w:p>
+      <w:pPr>
+        <w:rPr>
+          <w:rStyle w:val="a7"/>
+          <w:b w:val="0"/>
+          <w:bCs w:val="0"/>
+          <w:i w:val="0"/>
+          <w:iCs w:val="0"/>
+          <w:color w:val="auto"/>
+        </w:rPr>
+      </w:pPr>
+      <w:r>
+        <w:rPr>
+          <w:rStyle w:val="a7"/>
+          <w:rFonts w:hint="eastAsia"/>
+          <w:b w:val="0"/>
+          <w:bCs w:val="0"/>
+          <w:i w:val="0"/>
+          <w:iCs w:val="0"/>
+          <w:color w:val="auto"/>
+        </w:rPr>
+        <w:t>把所有看到的分析议题写到一张纸上，考虑：</w:t>
+      </w:r>
+    </w:p>
+    <w:p>
+      <w:pPr>
+        <w:pStyle w:val="a6"/>
+        <w:numPr>
+          <w:ilvl w:val="0"/>
+          <w:numId w:val="17"/>
+        </w:numPr>
+      </w:pPr>
+      <w:r>
+        <w:t xml:space="preserve">What was it that inspired this project in the first place? </w:t>
+      </w:r>
+    </w:p>
+    <w:p>
+      <w:pPr>
+        <w:pStyle w:val="a6"/>
+        <w:numPr>
+          <w:ilvl w:val="0"/>
+          <w:numId w:val="17"/>
+        </w:numPr>
+      </w:pPr>
+      <w:r>
+        <w:t>What were you looking for or aiming to analy</w:t>
+      </w:r>
+      <w:r>
+        <w:rPr>
+          <w:rFonts w:hint="eastAsia"/>
+        </w:rPr>
+        <w:t>z</w:t>
+      </w:r>
+      <w:r>
+        <w:t xml:space="preserve">e? </w:t>
+      </w:r>
+    </w:p>
+    <w:p>
+      <w:pPr>
+        <w:pStyle w:val="a6"/>
+        <w:numPr>
+          <w:ilvl w:val="0"/>
+          <w:numId w:val="17"/>
+        </w:numPr>
+      </w:pPr>
+      <w:r>
+        <w:t>What does the literature suggest is an important (or missing) area of research?</w:t>
+      </w:r>
+    </w:p>
+    <w:p>
+      <w:pPr>
+        <w:pStyle w:val="a6"/>
+        <w:numPr>
+          <w:ilvl w:val="0"/>
+          <w:numId w:val="17"/>
+        </w:numPr>
+      </w:pPr>
+      <w:r>
+        <w:t xml:space="preserve">Consider each possible ‘issue’ in your list in light of these considerations. </w:t>
+      </w:r>
+    </w:p>
+    <w:p>
+      <w:pPr>
+        <w:pStyle w:val="a6"/>
+        <w:numPr>
+          <w:ilvl w:val="0"/>
+          <w:numId w:val="17"/>
+        </w:numPr>
+      </w:pPr>
+      <w:r>
+        <w:t>Which might be the most fruitful for analysis?</w:t>
+      </w:r>
+    </w:p>
+    <w:p>
+      <w:pPr>
+        <w:pStyle w:val="a6"/>
+        <w:numPr>
+          <w:ilvl w:val="0"/>
+          <w:numId w:val="17"/>
+        </w:numPr>
+      </w:pPr>
+      <w:r>
+        <w:t xml:space="preserve"> Which ones, ultimately, are you most interested in or intrigued by?</w:t>
+      </w:r>
+    </w:p>
+    <w:p>
+      <w:pPr>
+        <w:rPr>
+          <w:rStyle w:val="a7"/>
+          <w:rFonts w:hint="eastAsia"/>
+          <w:b w:val="0"/>
+          <w:bCs w:val="0"/>
+          <w:i w:val="0"/>
+          <w:iCs w:val="0"/>
+          <w:color w:val="auto"/>
+        </w:rPr>
+      </w:pPr>
+      <w:r>
+        <w:rPr>
+          <w:b/>
+          <w:bCs/>
+          <w:i/>
+          <w:iCs/>
+          <w:color w:val="E97132" w:themeColor="accent2"/>
+        </w:rPr>
+        <w:t xml:space="preserve">Stage 5: </w:t>
+      </w:r>
+      <w:r>
+        <w:rPr>
+          <w:b/>
+          <w:bCs/>
+          <w:i/>
+          <w:iCs/>
+        </w:rPr>
+        <w:t>collect other instances of this analytical focus in your data corpus</w:t>
+      </w:r>
+    </w:p>
+    <w:p>
+      <w:r>
+        <w:rPr>
+          <w:rFonts w:hint="eastAsia"/>
+        </w:rPr>
+        <w:t>为第四部收集的议题找更多的实例，看看有没有疏漏，尽可能纳入相关实例</w:t>
+      </w:r>
+    </w:p>
+    <w:p>
+      <w:r>
+        <w:rPr>
+          <w:rFonts w:hint="eastAsia"/>
+        </w:rPr>
+        <w:t>这个过程和第二步很像</w:t>
+      </w:r>
+    </w:p>
+    <w:p>
+      <w:pPr>
+        <w:rPr>
+          <w:rStyle w:val="a7"/>
+          <w:rFonts w:hint="eastAsia"/>
+          <w:b w:val="0"/>
+          <w:bCs w:val="0"/>
+          <w:i w:val="0"/>
+          <w:iCs w:val="0"/>
+          <w:color w:val="auto"/>
+        </w:rPr>
+      </w:pPr>
+      <w:r>
+        <w:rPr>
+          <w:b/>
+          <w:bCs/>
+          <w:i/>
+          <w:iCs/>
+          <w:color w:val="E97132" w:themeColor="accent2"/>
+        </w:rPr>
+        <w:t xml:space="preserve">Stage </w:t>
+      </w:r>
+      <w:r>
+        <w:rPr>
+          <w:b/>
+          <w:bCs/>
+          <w:i/>
+          <w:iCs/>
+          <w:color w:val="E97132" w:themeColor="accent2"/>
+        </w:rPr>
+        <w:t xml:space="preserve">6: </w:t>
+      </w:r>
+      <w:r>
+        <w:rPr>
+          <w:b/>
+          <w:bCs/>
+          <w:i/>
+          <w:iCs/>
+        </w:rPr>
+        <w:t>Focus and refine the analysis (aka ‘how to stop analy</w:t>
+      </w:r>
+      <w:r>
+        <w:rPr>
+          <w:rFonts w:hint="eastAsia"/>
+          <w:b/>
+          <w:bCs/>
+          <w:i/>
+          <w:iCs/>
+        </w:rPr>
+        <w:t>z</w:t>
+      </w:r>
+      <w:r>
+        <w:rPr>
+          <w:b/>
+          <w:bCs/>
+          <w:i/>
+          <w:iCs/>
+        </w:rPr>
+        <w:t>ing’)</w:t>
+      </w:r>
+    </w:p>
+    <w:p>
+      <w:pPr>
+        <w:rPr>
+          <w:rFonts w:hint="eastAsia"/>
+        </w:rPr>
+      </w:pPr>
+      <w:r>
+        <w:rPr>
+          <w:rFonts w:hint="eastAsia"/>
+        </w:rPr>
+        <w:t>重复第三步</w:t>
+      </w:r>
+      <w:r>
+        <w:rPr>
+          <w:rFonts w:hint="eastAsia"/>
+        </w:rPr>
+        <w:t xml:space="preserve"> + </w:t>
+      </w:r>
+      <w:r>
+        <w:rPr>
+          <w:rFonts w:hint="eastAsia"/>
+        </w:rPr>
+        <w:t>开始写作</w:t>
+      </w:r>
+    </w:p>
+    <w:p>
+      <w:r>
+        <w:rPr>
+          <w:rFonts w:hint="eastAsia"/>
+        </w:rPr>
+        <w:t>重要的是整体视角</w:t>
+      </w:r>
+    </w:p>
+    <w:p>
+      <w:pPr>
+        <w:pStyle w:val="a6"/>
+        <w:numPr>
+          <w:ilvl w:val="0"/>
+          <w:numId w:val="17"/>
+        </w:numPr>
+      </w:pPr>
+      <w:r>
+        <w:rPr>
+          <w:rFonts w:hint="eastAsia"/>
+        </w:rPr>
+        <w:t>A</w:t>
+      </w:r>
+      <w:r>
+        <w:t xml:space="preserve">re there any patterns across the data segments? </w:t>
+      </w:r>
+    </w:p>
+    <w:p>
+      <w:pPr>
+        <w:pStyle w:val="a6"/>
+        <w:numPr>
+          <w:ilvl w:val="0"/>
+          <w:numId w:val="17"/>
+        </w:numPr>
+      </w:pPr>
+      <w:r>
+        <w:t xml:space="preserve">Is there coherence in how your analytical issue fits with the data? </w:t>
+      </w:r>
+    </w:p>
+    <w:p>
+      <w:pPr>
+        <w:pStyle w:val="a6"/>
+        <w:numPr>
+          <w:ilvl w:val="0"/>
+          <w:numId w:val="17"/>
+        </w:numPr>
+      </w:pPr>
+      <w:r>
+        <w:t>What new insights can you gain from analy</w:t>
+      </w:r>
+      <w:r>
+        <w:rPr>
+          <w:rFonts w:hint="eastAsia"/>
+        </w:rPr>
+        <w:t>z</w:t>
+      </w:r>
+      <w:r>
+        <w:t>ing lots of examples of the same sorts of issues?</w:t>
+      </w:r>
+    </w:p>
+    <w:p>
+      <w:r>
+        <w:rPr>
+          <w:rFonts w:hint="eastAsia"/>
+        </w:rPr>
+        <w:t>写作不要从充分分析后开始，因为不转化成详细分析，你很有可能没办法找到行不通的议题，也很难找到哪些是有分析深度是实例、哪些仅仅用了几个装置而已</w:t>
+      </w:r>
+    </w:p>
+    <w:p>
+      <w:r>
+        <w:lastRenderedPageBreak/>
+        <w:t>完成全部片段的分析并核对原始材料后，先挑选分析价值高、最能激发思考的片段开始写作。此时不用过度纠结最终选哪些材料，因为之后还要再检查这些引文是否能代表整个编码语料。写作时，把一个片段单独放进新文档，围绕它说明完成了什么社会行动、处理了哪些心理事务，以及这些是如何通过话语装置实现的。分析文字需要反复修改，而写作本身也是澄清和完善分析的过程。</w:t>
+      </w:r>
+    </w:p>
+    <w:p>
+      <w:pPr>
+        <w:rPr>
+          <w:rStyle w:val="a7"/>
+          <w:rFonts w:hint="eastAsia"/>
+        </w:rPr>
+      </w:pPr>
+      <w:r>
+        <w:rPr>
+          <w:rStyle w:val="a7"/>
+          <w:rFonts w:hint="eastAsia"/>
+        </w:rPr>
+        <w:t>Additional stage:</w:t>
+      </w:r>
+      <w:r>
+        <w:rPr>
+          <w:rStyle w:val="a7"/>
+          <w:rFonts w:hint="eastAsia"/>
+        </w:rPr>
+        <w:t xml:space="preserve"> </w:t>
+      </w:r>
+      <w:r>
+        <w:rPr>
+          <w:b/>
+          <w:bCs/>
+          <w:i/>
+          <w:iCs/>
+        </w:rPr>
+        <w:t>‘how do I know when I’m doing it right?</w:t>
+      </w:r>
+    </w:p>
+    <w:p>
+      <w:r>
+        <w:rPr>
+          <w:rFonts w:hint="eastAsia"/>
+          <w:b/>
+          <w:bCs/>
+        </w:rPr>
+        <w:t xml:space="preserve">1. </w:t>
+      </w:r>
+      <w:r>
+        <w:rPr>
+          <w:b/>
+          <w:bCs/>
+        </w:rPr>
+        <w:t>方法要透明</w:t>
+      </w:r>
+      <w:r>
+        <w:br/>
+      </w:r>
+      <w:r>
+        <w:t>要清楚说明数据怎么收集、怎么分析、为什么这样选材料，并用原始摘录展示分析依据，让读者能够自行判断。</w:t>
+      </w:r>
+      <w:r>
+        <w:t xml:space="preserve"> </w:t>
+      </w:r>
+    </w:p>
+    <w:p>
+      <w:r>
+        <w:rPr>
+          <w:rFonts w:hint="eastAsia"/>
+          <w:b/>
+          <w:bCs/>
+        </w:rPr>
+        <w:t xml:space="preserve">2. </w:t>
+      </w:r>
+      <w:r>
+        <w:rPr>
+          <w:b/>
+          <w:bCs/>
+        </w:rPr>
+        <w:t>解释要依据参与者自己的反应</w:t>
+      </w:r>
+      <w:r>
+        <w:br/>
+      </w:r>
+      <w:proofErr w:type="gramStart"/>
+      <w:r>
+        <w:t>不应凭研究者直觉判断一句话</w:t>
+      </w:r>
+      <w:r>
+        <w:t>“</w:t>
+      </w:r>
+      <w:proofErr w:type="gramEnd"/>
+      <w:r>
+        <w:t>是什么意思</w:t>
+      </w:r>
+      <w:r>
+        <w:t>”</w:t>
+      </w:r>
+      <w:r>
+        <w:t>，而要看参与者在后续互动中怎样理解和回应它，也就是</w:t>
+      </w:r>
+      <w:r>
+        <w:t xml:space="preserve"> next turn proof procedure</w:t>
+      </w:r>
+      <w:r>
+        <w:t>。</w:t>
+      </w:r>
+      <w:r>
+        <w:t xml:space="preserve"> </w:t>
+      </w:r>
+    </w:p>
+    <w:p>
+      <w:r>
+        <w:rPr>
+          <w:rFonts w:hint="eastAsia"/>
+          <w:b/>
+          <w:bCs/>
+        </w:rPr>
+        <w:t xml:space="preserve">3. </w:t>
+      </w:r>
+      <w:r>
+        <w:rPr>
+          <w:b/>
+          <w:bCs/>
+        </w:rPr>
+        <w:t>分析要整体连贯，并处理偏离案例</w:t>
+      </w:r>
+      <w:r>
+        <w:br/>
+      </w:r>
+      <w:r>
+        <w:t>各个细节要共同支持一个清楚的解释，而且分析要符合整个相关语料，而不是只符合少数精选片段。不符合模式的案例不能忽略，而要用来检验、修正和限定分析。</w:t>
+      </w:r>
+      <w:r>
+        <w:t xml:space="preserve"> </w:t>
+      </w:r>
+    </w:p>
+    <w:p>
+      <w:r>
+        <w:rPr>
+          <w:rFonts w:hint="eastAsia"/>
+          <w:b/>
+          <w:bCs/>
+        </w:rPr>
+        <w:t xml:space="preserve">4. </w:t>
+      </w:r>
+      <w:r>
+        <w:rPr>
+          <w:b/>
+          <w:bCs/>
+        </w:rPr>
+        <w:t>不仅分析话语的功能，也分析副作用和后果</w:t>
+      </w:r>
+      <w:r>
+        <w:br/>
+      </w:r>
+      <w:r>
+        <w:t>一种表达在完成某个行动时，可能同时产生新的身份、责任或矛盾。</w:t>
+      </w:r>
+      <w:proofErr w:type="gramStart"/>
+      <w:r>
+        <w:t>例如</w:t>
+      </w:r>
+      <w:r>
+        <w:t>“</w:t>
+      </w:r>
+      <w:proofErr w:type="gramEnd"/>
+      <w:r>
+        <w:t>我不喜欢牛排</w:t>
+      </w:r>
+      <w:r>
+        <w:t>”</w:t>
+      </w:r>
+      <w:r>
+        <w:t>可以用于拒绝食物，但也把这种偏好构造成稳定的，以后如果吃牛排就可能需要解释。</w:t>
+      </w:r>
+      <w:r>
+        <w:t xml:space="preserve"> </w:t>
+      </w:r>
+    </w:p>
+    <w:p>
+      <w:r>
+        <w:rPr>
+          <w:rFonts w:hint="eastAsia"/>
+          <w:b/>
+          <w:bCs/>
+        </w:rPr>
+        <w:t xml:space="preserve">5. </w:t>
+      </w:r>
+      <w:r>
+        <w:rPr>
+          <w:b/>
+          <w:bCs/>
+        </w:rPr>
+        <w:t>分析必须提供新的洞见，并联系既有研究</w:t>
+      </w:r>
+      <w:r>
+        <w:br/>
+      </w:r>
+      <w:r>
+        <w:t>不能只复述材料内容，而要通过</w:t>
+      </w:r>
+      <w:r>
+        <w:t>DP</w:t>
+      </w:r>
+      <w:r>
+        <w:t>揭示普通话语中更深层的互动机制，同时说明研究如何补充、修正或发展已有文献。</w:t>
+      </w:r>
+    </w:p>
+    <w:p>
+      <w:r>
+        <w:t>作者提示</w:t>
+      </w:r>
+      <w:r>
+        <w:rPr>
+          <w:rFonts w:hint="eastAsia"/>
+        </w:rPr>
+        <w:t>新手</w:t>
+      </w:r>
+      <w:r>
+        <w:t>常犯的错误：</w:t>
+      </w:r>
+    </w:p>
+    <w:p>
+      <w:pPr>
+        <w:ind w:left="360"/>
+      </w:pPr>
+      <w:r>
+        <w:rPr>
+          <w:rFonts w:ascii="Segoe UI Symbol" w:hAnsi="Segoe UI Symbol" w:cs="Segoe UI Symbol"/>
+        </w:rPr>
+        <w:t>✘</w:t>
+      </w:r>
+      <w:r>
+        <w:rPr>
+          <w:rFonts w:ascii="Segoe UI Symbol" w:hAnsi="Segoe UI Symbol" w:cs="Segoe UI Symbol" w:hint="eastAsia"/>
+        </w:rPr>
+        <w:t xml:space="preserve"> </w:t>
+      </w:r>
+      <w:r>
+        <w:rPr>
+          <w:rFonts w:hint="eastAsia"/>
+        </w:rPr>
+        <w:t>光总结，没有任何分析或者是解释</w:t>
+      </w:r>
+    </w:p>
+    <w:p>
+      <w:pPr>
+        <w:ind w:firstLine="360"/>
+      </w:pPr>
+      <w:r>
+        <w:rPr>
+          <w:rFonts w:ascii="Segoe UI Symbol" w:hAnsi="Segoe UI Symbol" w:cs="Segoe UI Symbol"/>
+        </w:rPr>
+        <w:t>✘</w:t>
+      </w:r>
+      <w:r>
+        <w:rPr>
+          <w:rFonts w:ascii="Segoe UI Symbol" w:hAnsi="Segoe UI Symbol" w:cs="Segoe UI Symbol" w:hint="eastAsia"/>
+        </w:rPr>
+        <w:t xml:space="preserve"> </w:t>
+      </w:r>
+      <w:r>
+        <w:rPr>
+          <w:rFonts w:hint="eastAsia"/>
+        </w:rPr>
+        <w:t>做是非善恶的道德评价</w:t>
+      </w:r>
+    </w:p>
+    <w:p>
+      <w:pPr>
+        <w:ind w:firstLine="360"/>
+      </w:pPr>
+      <w:r>
+        <w:rPr>
+          <w:rFonts w:ascii="Segoe UI Symbol" w:hAnsi="Segoe UI Symbol" w:cs="Segoe UI Symbol"/>
+        </w:rPr>
+        <w:t>✘</w:t>
+      </w:r>
+      <w:r>
+        <w:rPr>
+          <w:rFonts w:ascii="Segoe UI Symbol" w:hAnsi="Segoe UI Symbol" w:cs="Segoe UI Symbol" w:hint="eastAsia"/>
+        </w:rPr>
+        <w:t xml:space="preserve"> </w:t>
+      </w:r>
+      <w:r>
+        <w:rPr>
+          <w:rFonts w:hint="eastAsia"/>
+        </w:rPr>
+        <w:t>引文太多、太少（没有上下文）、解释的份量不够</w:t>
+      </w:r>
+    </w:p>
+    <w:p>
+      <w:pPr>
+        <w:ind w:firstLine="360"/>
+      </w:pPr>
+      <w:r>
+        <w:rPr>
+          <w:rFonts w:ascii="Segoe UI Symbol" w:hAnsi="Segoe UI Symbol" w:cs="Segoe UI Symbol"/>
+        </w:rPr>
+        <w:t>✘</w:t>
+      </w:r>
+      <w:r>
+        <w:rPr>
+          <w:rFonts w:ascii="Segoe UI Symbol" w:hAnsi="Segoe UI Symbol" w:cs="Segoe UI Symbol" w:hint="eastAsia"/>
+        </w:rPr>
+        <w:t xml:space="preserve"> </w:t>
+      </w:r>
+      <w:r>
+        <w:rPr>
+          <w:rFonts w:hint="eastAsia"/>
+        </w:rPr>
+        <w:t>循环辩护：</w:t>
+      </w:r>
+      <w:r>
+        <w:t>因为它是辩护，所以归入辩护模式</w:t>
+      </w:r>
+      <w:r>
+        <w:t xml:space="preserve"> → </w:t>
+      </w:r>
+      <w:r>
+        <w:t>因为归入辩护模式，所以证明存在辩护</w:t>
+      </w:r>
+    </w:p>
+    <w:p>
+      <w:pPr>
+        <w:ind w:firstLine="360"/>
+      </w:pPr>
+      <w:r>
+        <w:rPr>
+          <w:rFonts w:ascii="Segoe UI Symbol" w:hAnsi="Segoe UI Symbol" w:cs="Segoe UI Symbol"/>
+        </w:rPr>
+        <w:t>✘</w:t>
+      </w:r>
+      <w:r>
+        <w:rPr>
+          <w:rFonts w:ascii="Segoe UI Symbol" w:hAnsi="Segoe UI Symbol" w:cs="Segoe UI Symbol" w:hint="eastAsia"/>
+        </w:rPr>
+        <w:t xml:space="preserve"> </w:t>
+      </w:r>
+      <w:r>
+        <w:rPr>
+          <w:rFonts w:hint="eastAsia"/>
+        </w:rPr>
+        <w:t>直接推断真实心理状态</w:t>
+      </w:r>
+    </w:p>
+    <w:p>
+      <w:pPr>
+        <w:ind w:firstLine="360"/>
+      </w:pPr>
+      <w:r>
+        <w:rPr>
+          <w:rFonts w:ascii="Segoe UI Symbol" w:hAnsi="Segoe UI Symbol" w:cs="Segoe UI Symbol"/>
+        </w:rPr>
+        <w:t>✘</w:t>
+      </w:r>
+      <w:r>
+        <w:rPr>
+          <w:rFonts w:ascii="Segoe UI Symbol" w:hAnsi="Segoe UI Symbol" w:cs="Segoe UI Symbol" w:hint="eastAsia"/>
+        </w:rPr>
+        <w:t xml:space="preserve"> </w:t>
+      </w:r>
+      <w:r>
+        <w:rPr>
+          <w:rFonts w:hint="eastAsia"/>
+        </w:rPr>
+        <w:t>把质性材料写成虚假的总体调查（人们通常</w:t>
+      </w:r>
+      <w:r>
+        <w:t>…</w:t>
+      </w:r>
+      <w:r>
+        <w:rPr>
+          <w:rFonts w:hint="eastAsia"/>
+        </w:rPr>
+        <w:t>，女性更容易</w:t>
+      </w:r>
+      <w:r>
+        <w:t>…</w:t>
+      </w:r>
+      <w:r>
+        <w:rPr>
+          <w:rFonts w:hint="eastAsia"/>
+        </w:rPr>
+        <w:t>）</w:t>
+      </w:r>
+    </w:p>
+    <w:p>
+      <w:pPr>
+        <w:ind w:firstLine="360"/>
+        <w:rPr>
+          <w:rFonts w:hint="eastAsia"/>
+        </w:rPr>
+      </w:pPr>
+      <w:r>
+        <w:rPr>
+          <w:rFonts w:ascii="Segoe UI Symbol" w:hAnsi="Segoe UI Symbol" w:cs="Segoe UI Symbol"/>
+        </w:rPr>
+        <w:t>✘</w:t>
+      </w:r>
+      <w:r>
+        <w:rPr>
+          <w:rFonts w:ascii="Segoe UI Symbol" w:hAnsi="Segoe UI Symbol" w:cs="Segoe UI Symbol" w:hint="eastAsia"/>
+        </w:rPr>
+        <w:t xml:space="preserve"> </w:t>
+      </w:r>
+      <w:r>
+        <w:rPr>
+          <w:rFonts w:hint="eastAsia"/>
+        </w:rPr>
+        <w:t>只是找到了装置，但不说明装置怎么运作</w:t>
+      </w:r>
+      <w:r>
+        <w:rPr>
+          <w:rFonts w:hint="eastAsia"/>
+        </w:rPr>
+        <w:t>（跟第一个错误差不多）</w:t>
+      </w:r>
     </w:p>
     <w:p>
       <w:pPr>
         <w:pStyle w:val="2"/>
-      </w:pPr>
-      <w:r>
-        <w:rPr>
-          <w:rFonts w:hint="eastAsia"/>
-        </w:rPr>
-        <w:lastRenderedPageBreak/>
+        <w:rPr>
+          <w:rFonts w:hint="eastAsia"/>
+        </w:rPr>
+      </w:pPr>
+      <w:r>
+        <w:rPr>
+          <w:rFonts w:hint="eastAsia"/>
+        </w:rPr>
+        <w:t xml:space="preserve">2. </w:t>
+      </w:r>
+      <w:r>
+        <w:rPr>
+          <w:rFonts w:hint="eastAsia"/>
+        </w:rPr>
+        <w:t>抽样执行步骤</w:t>
+      </w:r>
+    </w:p>
+    <w:p/>
+    <w:p/>
+    <w:p/>
+    <w:p/>
+    <w:p>
+      <w:r>
+        <w:t>这个任务放在</w:t>
+      </w:r>
+      <w:r>
+        <w:t>pilot coding</w:t>
+      </w:r>
+      <w:r>
+        <w:t>和</w:t>
+      </w:r>
+      <w:r>
+        <w:t>validation coding</w:t>
+      </w:r>
+      <w:r>
+        <w:t>阶段。第一步，我先把每篇帖子关于</w:t>
+      </w:r>
+      <w:r>
+        <w:t>AI</w:t>
+      </w:r>
+      <w:r>
+        <w:t>的表面内容总结出来：在提到</w:t>
+      </w:r>
+      <w:r>
+        <w:t>AI</w:t>
+      </w:r>
+      <w:r>
+        <w:t>之前发生了什么，</w:t>
+      </w:r>
+      <w:r>
+        <w:t>AI</w:t>
+      </w:r>
+      <w:r>
+        <w:t>在帖子里被怎么使用，提到</w:t>
+      </w:r>
+      <w:r>
+        <w:t>AI</w:t>
+      </w:r>
+      <w:r>
+        <w:t>之后又发生了什么，以及发帖人在字面上为什么要发这篇帖子。每篇用一两句话概括，然后整理成一个大表格。</w:t>
+      </w:r>
+    </w:p>
+    <w:p>
+      <w:r>
+        <w:t>接下来，在每个社区内部依次判断：</w:t>
+      </w:r>
+    </w:p>
+    <w:p>
+      <w:r>
+        <w:t>社区整体上是不是已经比较同质</w:t>
+      </w:r>
+      <w:r>
+        <w:br/>
+        <w:t xml:space="preserve">→ </w:t>
+      </w:r>
+      <w:r>
+        <w:t>如果不是，分别看</w:t>
+      </w:r>
+      <w:r>
+        <w:t>Timeframe</w:t>
+      </w:r>
+      <w:r>
+        <w:t>、</w:t>
+      </w:r>
+      <w:r>
+        <w:t>Source</w:t>
+      </w:r>
+      <w:r>
+        <w:t>和</w:t>
+      </w:r>
+      <w:r>
+        <w:t>Type</w:t>
+      </w:r>
+      <w:r>
+        <w:t>这三个维度中，是否有某一个维度能够比较清楚地区分不同的表层内容，并记录每个维度具体对应什么差异</w:t>
+      </w:r>
+      <w:r>
+        <w:br/>
+        <w:t xml:space="preserve">→ </w:t>
+      </w:r>
+      <w:r>
+        <w:t>如果单个维度仍然不够，再看两个或三个维度的组合是否能形成相对稳定的分组，以及哪些组合最常对应某种表层内容</w:t>
+      </w:r>
+      <w:r>
+        <w:br/>
+        <w:t xml:space="preserve">→ </w:t>
+      </w:r>
+      <w:r>
+        <w:t>如果社区内部仍然很异质，再比较其他社区中相同维度组合的帖子，看它们是否也呈现相似的表层组织，从而判断是否存在跨社区重复出现的配置</w:t>
+      </w:r>
+      <w:r>
+        <w:br/>
+        <w:t xml:space="preserve">→ </w:t>
+      </w:r>
+      <w:r>
+        <w:t>完成这些比较后，再区分哪些帖子已经能被现有规律覆盖，哪些仍然无法稳定归类，并计算残余部分在该社区中是否占很大比例。</w:t>
+      </w:r>
+    </w:p>
+    <w:p>
+      <w:r>
+        <w:t>如果已经穷尽了社区整体、单个维度、维度组合以及跨社区相同组合的比较，但某个社区仍然具有很强的异质性，而且该社区中有很大一部分帖子在其他社区的相同维度组合中也找不到重复的表层规律，那么就有理由怀疑，现有</w:t>
+      </w:r>
+      <w:r>
+        <w:t>development materials</w:t>
+      </w:r>
+      <w:r>
+        <w:t>还没有覆盖这个社区中的许多实例或变体。</w:t>
+      </w:r>
+    </w:p>
+    <w:p>
+      <w:r>
+        <w:t>在这种情况下，已经能够被现有规律覆盖的部分仍然按照规定好的抽样域进行抽样；但对于其余无法稳定归类的部分，不再继续强行细分新的规定性类别，而是把它们单独组成一个残余池，改用随机抽样，并适当提高这一部分的抽样比例，以增加后续正式分析中发现此前没有出现过的实例、变体和反例的机会。</w:t>
+      </w:r>
+    </w:p>
+    <w:p>
+      <w:r>
+        <w:t>在正式分析开始后，再检查</w:t>
+      </w:r>
+      <w:r>
+        <w:t>fresh sample</w:t>
+      </w:r>
+      <w:r>
+        <w:t>中有多少帖子符合原来的表层规律，有多少是在原有规律上增加了新变体，有多少与原有规律冲突，以及有多少完全没有在</w:t>
+      </w:r>
+      <w:r>
+        <w:t>development materials</w:t>
+      </w:r>
+      <w:r>
+        <w:t>中出现过。</w:t>
+      </w:r>
+    </w:p>
+    <w:p>
+      <w:pPr>
+        <w:rPr>
+          <w:rStyle w:val="a7"/>
+          <w:rFonts w:hint="eastAsia"/>
+          <w:b w:val="0"/>
+          <w:bCs w:val="0"/>
+          <w:i w:val="0"/>
+          <w:iCs w:val="0"/>
+          <w:color w:val="auto"/>
+        </w:rPr>
+      </w:pPr>
+    </w:p>
+    <w:p>
+      <w:pPr>
+        <w:rPr>
+          <w:rStyle w:val="a7"/>
+          <w:b w:val="0"/>
+          <w:bCs w:val="0"/>
+          <w:i w:val="0"/>
+          <w:iCs w:val="0"/>
+          <w:color w:val="auto"/>
+        </w:rPr>
+      </w:pPr>
+    </w:p>
+    <w:p>
+      <w:pPr>
+        <w:rPr>
+          <w:rStyle w:val="a7"/>
+          <w:rFonts w:hint="eastAsia"/>
+          <w:b w:val="0"/>
+          <w:bCs w:val="0"/>
+          <w:i w:val="0"/>
+          <w:iCs w:val="0"/>
+          <w:color w:val="auto"/>
+        </w:rPr>
+      </w:pPr>
+    </w:p>
+    <w:p>
+      <w:pPr>
+        <w:rPr>
+          <w:rFonts w:hint="eastAsia"/>
+        </w:rPr>
+      </w:pPr>
+    </w:p>
+    <w:p>
+      <w:pPr>
+        <w:rPr>
+          <w:rFonts w:hint="eastAsia"/>
+        </w:rPr>
+      </w:pPr>
+    </w:p>
+    <w:p>
+      <w:pPr>
+        <w:rPr>
+          <w:rStyle w:val="a7"/>
+        </w:rPr>
+      </w:pPr>
+      <w:r>
+        <w:rPr>
+          <w:rStyle w:val="a7"/>
+          <w:rFonts w:hint="eastAsia"/>
+        </w:rPr>
+        <w:t>这个任务放在了</w:t>
+      </w:r>
+      <w:r>
+        <w:rPr>
+          <w:rStyle w:val="a7"/>
+          <w:rFonts w:hint="eastAsia"/>
+        </w:rPr>
+        <w:t>pilot coding</w:t>
+      </w:r>
+      <w:r>
+        <w:rPr>
+          <w:rStyle w:val="a7"/>
+        </w:rPr>
+        <w:t>和</w:t>
+      </w:r>
+      <w:r>
+        <w:rPr>
+          <w:rStyle w:val="a7"/>
+        </w:rPr>
+        <w:t>validation</w:t>
+      </w:r>
+      <w:r>
+        <w:rPr>
+          <w:rStyle w:val="a7"/>
+          <w:rFonts w:hint="eastAsia"/>
+        </w:rPr>
+        <w:t xml:space="preserve"> </w:t>
+      </w:r>
+      <w:r>
+        <w:rPr>
+          <w:rStyle w:val="a7"/>
+        </w:rPr>
+        <w:t>coding</w:t>
+      </w:r>
+      <w:r>
+        <w:rPr>
+          <w:rStyle w:val="a7"/>
+          <w:rFonts w:hint="eastAsia"/>
+        </w:rPr>
+        <w:t>时期</w:t>
+      </w:r>
+      <w:r>
+        <w:rPr>
+          <w:rStyle w:val="a7"/>
+          <w:rFonts w:hint="eastAsia"/>
+        </w:rPr>
+        <w:t>：</w:t>
+      </w:r>
+    </w:p>
+    <w:tbl>
+      <w:tblPr>
+        <w:tblStyle w:val="af3"/>
+        <w:tblW w:w="0" w:type="auto"/>
+        <w:tblLook w:val="04A0" w:firstRow="1" w:lastRow="0" w:firstColumn="1" w:lastColumn="0" w:noHBand="0" w:noVBand="1"/>
+      </w:tblPr>
+      <w:tblGrid>
+        <w:gridCol w:w="2972"/>
+        <w:gridCol w:w="6378"/>
+      </w:tblGrid>
+      <w:tr>
+        <w:tc>
+          <w:tcPr>
+            <w:tcW w:w="2972" w:type="dxa"/>
+            <w:shd w:val="clear" w:color="auto" w:fill="FCE4D6"/>
+          </w:tcPr>
+          <w:p>
+            <w:pPr>
+              <w:rPr>
+                <w:rStyle w:val="a7"/>
+                <w:i w:val="0"/>
+                <w:iCs w:val="0"/>
+                <w:color w:val="auto"/>
+              </w:rPr>
+            </w:pPr>
+            <w:r>
+              <w:rPr>
+                <w:rStyle w:val="a7"/>
+                <w:rFonts w:hint="eastAsia"/>
+                <w:i w:val="0"/>
+                <w:iCs w:val="0"/>
+                <w:color w:val="auto"/>
+              </w:rPr>
+              <w:t>时期</w:t>
+            </w:r>
+          </w:p>
+        </w:tc>
+        <w:tc>
+          <w:tcPr>
+            <w:tcW w:w="6378" w:type="dxa"/>
+            <w:shd w:val="clear" w:color="auto" w:fill="FCE4D6"/>
+          </w:tcPr>
+          <w:p>
+            <w:pPr>
+              <w:rPr>
+                <w:rStyle w:val="a7"/>
+                <w:i w:val="0"/>
+                <w:iCs w:val="0"/>
+                <w:color w:val="auto"/>
+              </w:rPr>
+            </w:pPr>
+            <w:r>
+              <w:rPr>
+                <w:rStyle w:val="a7"/>
+                <w:rFonts w:hint="eastAsia"/>
+                <w:i w:val="0"/>
+                <w:iCs w:val="0"/>
+                <w:color w:val="auto"/>
+              </w:rPr>
+              <w:t>干什么</w:t>
+            </w:r>
+          </w:p>
+        </w:tc>
+      </w:tr>
+      <w:tr>
+        <w:tc>
+          <w:tcPr>
+            <w:tcW w:w="2972" w:type="dxa"/>
+            <w:vMerge w:val="restart"/>
+          </w:tcPr>
+          <w:p>
+            <w:pPr>
+              <w:rPr>
+                <w:rStyle w:val="a7"/>
+                <w:rFonts w:hint="eastAsia"/>
+                <w:b w:val="0"/>
+                <w:bCs w:val="0"/>
+                <w:i w:val="0"/>
+                <w:iCs w:val="0"/>
+                <w:color w:val="auto"/>
+              </w:rPr>
+            </w:pPr>
+            <w:r>
+              <w:rPr>
+                <w:rStyle w:val="a7"/>
+                <w:b w:val="0"/>
+                <w:bCs w:val="0"/>
+                <w:i w:val="0"/>
+                <w:iCs w:val="0"/>
+                <w:color w:val="auto"/>
+              </w:rPr>
+              <w:t>pilot</w:t>
+            </w:r>
+            <w:r>
+              <w:rPr>
+                <w:rStyle w:val="a7"/>
+                <w:rFonts w:hint="eastAsia"/>
+                <w:b w:val="0"/>
+                <w:bCs w:val="0"/>
+                <w:i w:val="0"/>
+                <w:iCs w:val="0"/>
+                <w:color w:val="auto"/>
+              </w:rPr>
+              <w:t xml:space="preserve"> coding</w:t>
+            </w:r>
+          </w:p>
+        </w:tc>
+        <w:tc>
+          <w:tcPr>
+            <w:tcW w:w="6378" w:type="dxa"/>
+          </w:tcPr>
+          <w:p>
+            <w:pPr>
+              <w:rPr>
+                <w:rStyle w:val="a7"/>
+                <w:rFonts w:hint="eastAsia"/>
+                <w:b w:val="0"/>
+                <w:bCs w:val="0"/>
+                <w:i w:val="0"/>
+                <w:iCs w:val="0"/>
+                <w:color w:val="auto"/>
+              </w:rPr>
+            </w:pPr>
+            <w:r>
+              <w:rPr>
+                <w:rStyle w:val="a7"/>
+                <w:rFonts w:hint="eastAsia"/>
+                <w:i w:val="0"/>
+                <w:iCs w:val="0"/>
+                <w:color w:val="auto"/>
+              </w:rPr>
+              <w:t>和</w:t>
+            </w:r>
+            <w:r>
+              <w:rPr>
+                <w:rStyle w:val="a7"/>
+                <w:rFonts w:hint="eastAsia"/>
+                <w:i w:val="0"/>
+                <w:iCs w:val="0"/>
+                <w:color w:val="auto"/>
+              </w:rPr>
+              <w:t>AI</w:t>
+            </w:r>
+            <w:r>
+              <w:rPr>
+                <w:rStyle w:val="a7"/>
+                <w:rFonts w:hint="eastAsia"/>
+                <w:i w:val="0"/>
+                <w:iCs w:val="0"/>
+                <w:color w:val="auto"/>
+              </w:rPr>
+              <w:t>协作出一份</w:t>
+            </w:r>
+            <w:r>
+              <w:rPr>
+                <w:rStyle w:val="a7"/>
+                <w:rFonts w:hint="eastAsia"/>
+                <w:i w:val="0"/>
+                <w:iCs w:val="0"/>
+                <w:color w:val="auto"/>
+              </w:rPr>
+              <w:t>coding manual</w:t>
+            </w:r>
+            <w:r>
+              <w:rPr>
+                <w:rStyle w:val="a7"/>
+                <w:rFonts w:hint="eastAsia"/>
+                <w:b w:val="0"/>
+                <w:bCs w:val="0"/>
+                <w:i w:val="0"/>
+                <w:iCs w:val="0"/>
+                <w:color w:val="auto"/>
+              </w:rPr>
+              <w:t>：第一步，作者自己出一份判断，</w:t>
+            </w:r>
+            <w:r>
+              <w:rPr>
+                <w:rStyle w:val="a7"/>
+                <w:rFonts w:hint="eastAsia"/>
+                <w:b w:val="0"/>
+                <w:bCs w:val="0"/>
+                <w:i w:val="0"/>
+                <w:iCs w:val="0"/>
+                <w:color w:val="auto"/>
+              </w:rPr>
+              <w:t>AI</w:t>
+            </w:r>
+            <w:r>
+              <w:rPr>
+                <w:rStyle w:val="a7"/>
+                <w:rFonts w:hint="eastAsia"/>
+                <w:b w:val="0"/>
+                <w:bCs w:val="0"/>
+                <w:i w:val="0"/>
+                <w:iCs w:val="0"/>
+                <w:color w:val="auto"/>
+              </w:rPr>
+              <w:t>出一份判断，并且让</w:t>
+            </w:r>
+            <w:r>
+              <w:rPr>
+                <w:rStyle w:val="a7"/>
+                <w:rFonts w:hint="eastAsia"/>
+                <w:b w:val="0"/>
+                <w:bCs w:val="0"/>
+                <w:i w:val="0"/>
+                <w:iCs w:val="0"/>
+                <w:color w:val="auto"/>
+              </w:rPr>
+              <w:t>AI</w:t>
+            </w:r>
+            <w:r>
+              <w:rPr>
+                <w:rStyle w:val="a7"/>
+                <w:rFonts w:hint="eastAsia"/>
+                <w:b w:val="0"/>
+                <w:bCs w:val="0"/>
+                <w:i w:val="0"/>
+                <w:iCs w:val="0"/>
+                <w:color w:val="auto"/>
+              </w:rPr>
+              <w:t>说出自己混淆的地方在哪里。第二</w:t>
+            </w:r>
+            <w:r>
+              <w:rPr>
+                <w:rStyle w:val="a7"/>
+                <w:rFonts w:hint="eastAsia"/>
+                <w:b w:val="0"/>
+                <w:bCs w:val="0"/>
+                <w:i w:val="0"/>
+                <w:iCs w:val="0"/>
+                <w:color w:val="auto"/>
+              </w:rPr>
+              <w:lastRenderedPageBreak/>
+              <w:t>步，在有出现人机分歧的时候，作者先让</w:t>
+            </w:r>
+            <w:r>
+              <w:rPr>
+                <w:rStyle w:val="a7"/>
+                <w:rFonts w:hint="eastAsia"/>
+                <w:b w:val="0"/>
+                <w:bCs w:val="0"/>
+                <w:i w:val="0"/>
+                <w:iCs w:val="0"/>
+                <w:color w:val="auto"/>
+              </w:rPr>
+              <w:t xml:space="preserve"> AI</w:t>
+            </w:r>
+            <w:r>
+              <w:rPr>
+                <w:rStyle w:val="a7"/>
+                <w:rFonts w:hint="eastAsia"/>
+                <w:b w:val="0"/>
+                <w:bCs w:val="0"/>
+                <w:i w:val="0"/>
+                <w:iCs w:val="0"/>
+                <w:color w:val="auto"/>
+              </w:rPr>
+              <w:t>给出依据，如果还有分歧，继续讨论。第三步，假如作者坚定地认为自己正确，作者会让</w:t>
+            </w:r>
+            <w:r>
+              <w:rPr>
+                <w:rStyle w:val="a7"/>
+                <w:rFonts w:hint="eastAsia"/>
+                <w:b w:val="0"/>
+                <w:bCs w:val="0"/>
+                <w:i w:val="0"/>
+                <w:iCs w:val="0"/>
+                <w:color w:val="auto"/>
+              </w:rPr>
+              <w:t>AI</w:t>
+            </w:r>
+            <w:r>
+              <w:rPr>
+                <w:rStyle w:val="a7"/>
+                <w:rFonts w:hint="eastAsia"/>
+                <w:b w:val="0"/>
+                <w:bCs w:val="0"/>
+                <w:i w:val="0"/>
+                <w:iCs w:val="0"/>
+                <w:color w:val="auto"/>
+              </w:rPr>
+              <w:t>给出自己的依据并让</w:t>
+            </w:r>
+            <w:r>
+              <w:rPr>
+                <w:rStyle w:val="a7"/>
+                <w:rFonts w:hint="eastAsia"/>
+                <w:b w:val="0"/>
+                <w:bCs w:val="0"/>
+                <w:i w:val="0"/>
+                <w:iCs w:val="0"/>
+                <w:color w:val="auto"/>
+              </w:rPr>
+              <w:t>AI</w:t>
+            </w:r>
+            <w:r>
+              <w:rPr>
+                <w:rStyle w:val="a7"/>
+                <w:rFonts w:hint="eastAsia"/>
+                <w:b w:val="0"/>
+                <w:bCs w:val="0"/>
+                <w:i w:val="0"/>
+                <w:iCs w:val="0"/>
+                <w:color w:val="auto"/>
+              </w:rPr>
+              <w:t>回答刚才混淆的地方再哪里，最后由作者改进</w:t>
+            </w:r>
+            <w:r>
+              <w:rPr>
+                <w:rStyle w:val="a7"/>
+                <w:rFonts w:hint="eastAsia"/>
+                <w:b w:val="0"/>
+                <w:bCs w:val="0"/>
+                <w:i w:val="0"/>
+                <w:iCs w:val="0"/>
+                <w:color w:val="auto"/>
+              </w:rPr>
+              <w:t>manual</w:t>
+            </w:r>
+          </w:p>
+        </w:tc>
+      </w:tr>
+      <w:tr>
+        <w:tc>
+          <w:tcPr>
+            <w:tcW w:w="2972" w:type="dxa"/>
+            <w:vMerge/>
+          </w:tcPr>
+          <w:p>
+            <w:pPr>
+              <w:rPr>
+                <w:rStyle w:val="a7"/>
+                <w:b w:val="0"/>
+                <w:bCs w:val="0"/>
+                <w:i w:val="0"/>
+                <w:iCs w:val="0"/>
+                <w:color w:val="auto"/>
+              </w:rPr>
+            </w:pPr>
+          </w:p>
+        </w:tc>
+        <w:tc>
+          <w:tcPr>
+            <w:tcW w:w="6378" w:type="dxa"/>
+          </w:tcPr>
+          <w:p>
+            <w:pPr>
+              <w:rPr>
+                <w:rStyle w:val="a7"/>
+                <w:rFonts w:hint="eastAsia"/>
+                <w:b w:val="0"/>
+                <w:bCs w:val="0"/>
+                <w:i w:val="0"/>
+                <w:iCs w:val="0"/>
+                <w:color w:val="auto"/>
+              </w:rPr>
+            </w:pPr>
+            <w:r>
+              <w:rPr>
+                <w:rStyle w:val="a7"/>
+                <w:rFonts w:hint="eastAsia"/>
+                <w:i w:val="0"/>
+                <w:iCs w:val="0"/>
+                <w:color w:val="auto"/>
+              </w:rPr>
+              <w:t>执行</w:t>
+            </w:r>
+            <w:r>
+              <w:rPr>
+                <w:rStyle w:val="a7"/>
+                <w:rFonts w:hint="eastAsia"/>
+                <w:i w:val="0"/>
+                <w:iCs w:val="0"/>
+                <w:color w:val="auto"/>
+              </w:rPr>
+              <w:t>read data</w:t>
+            </w:r>
+            <w:r>
+              <w:rPr>
+                <w:rStyle w:val="a7"/>
+                <w:rFonts w:hint="eastAsia"/>
+                <w:i w:val="0"/>
+                <w:iCs w:val="0"/>
+                <w:color w:val="auto"/>
+              </w:rPr>
+              <w:t>阶段：</w:t>
+            </w:r>
+            <w:r>
+              <w:rPr>
+                <w:rStyle w:val="a7"/>
+                <w:rFonts w:hint="eastAsia"/>
+                <w:b w:val="0"/>
+                <w:bCs w:val="0"/>
+                <w:i w:val="0"/>
+                <w:iCs w:val="0"/>
+                <w:color w:val="auto"/>
+              </w:rPr>
+              <w:t>熟悉</w:t>
+            </w:r>
+            <w:r>
+              <w:rPr>
+                <w:rStyle w:val="a7"/>
+                <w:rFonts w:hint="eastAsia"/>
+                <w:b w:val="0"/>
+                <w:bCs w:val="0"/>
+                <w:i w:val="0"/>
+                <w:iCs w:val="0"/>
+                <w:color w:val="auto"/>
+              </w:rPr>
+              <w:t>DP</w:t>
+            </w:r>
+            <w:r>
+              <w:rPr>
+                <w:rStyle w:val="a7"/>
+                <w:rFonts w:hint="eastAsia"/>
+                <w:b w:val="0"/>
+                <w:bCs w:val="0"/>
+                <w:i w:val="0"/>
+                <w:iCs w:val="0"/>
+                <w:color w:val="auto"/>
+              </w:rPr>
+              <w:t>视角，大概了解每篇帖子的内容和组织</w:t>
+            </w:r>
+            <w:r>
+              <w:rPr>
+                <w:rStyle w:val="a7"/>
+                <w:rFonts w:hint="eastAsia"/>
+                <w:b w:val="0"/>
+                <w:bCs w:val="0"/>
+                <w:i w:val="0"/>
+                <w:iCs w:val="0"/>
+                <w:color w:val="auto"/>
+              </w:rPr>
+              <w:t>，自称的发</w:t>
+            </w:r>
+            <w:proofErr w:type="gramStart"/>
+            <w:r>
+              <w:rPr>
+                <w:rStyle w:val="a7"/>
+                <w:rFonts w:hint="eastAsia"/>
+                <w:b w:val="0"/>
+                <w:bCs w:val="0"/>
+                <w:i w:val="0"/>
+                <w:iCs w:val="0"/>
+                <w:color w:val="auto"/>
+              </w:rPr>
+              <w:t>帖目的</w:t>
+            </w:r>
+            <w:proofErr w:type="gramEnd"/>
+            <w:r>
+              <w:rPr>
+                <w:rStyle w:val="a7"/>
+                <w:rFonts w:hint="eastAsia"/>
+                <w:b w:val="0"/>
+                <w:bCs w:val="0"/>
+                <w:i w:val="0"/>
+                <w:iCs w:val="0"/>
+                <w:color w:val="auto"/>
+              </w:rPr>
+              <w:t>是什么</w:t>
+            </w:r>
+          </w:p>
+        </w:tc>
+      </w:tr>
+      <w:tr>
+        <w:tc>
+          <w:tcPr>
+            <w:tcW w:w="2972" w:type="dxa"/>
+          </w:tcPr>
+          <w:p>
+            <w:pPr>
+              <w:rPr>
+                <w:rStyle w:val="a7"/>
+                <w:rFonts w:hint="eastAsia"/>
+                <w:b w:val="0"/>
+                <w:bCs w:val="0"/>
+                <w:i w:val="0"/>
+                <w:iCs w:val="0"/>
+                <w:color w:val="auto"/>
+              </w:rPr>
+            </w:pPr>
+            <w:r>
+              <w:rPr>
+                <w:rStyle w:val="a7"/>
+                <w:rFonts w:hint="eastAsia"/>
+                <w:b w:val="0"/>
+                <w:bCs w:val="0"/>
+                <w:i w:val="0"/>
+                <w:iCs w:val="0"/>
+                <w:color w:val="auto"/>
+              </w:rPr>
+              <w:t>validation coding</w:t>
+            </w:r>
+          </w:p>
+        </w:tc>
+        <w:tc>
+          <w:tcPr>
+            <w:tcW w:w="6378" w:type="dxa"/>
+          </w:tcPr>
+          <w:p>
+            <w:pPr>
+              <w:rPr>
+                <w:rStyle w:val="a7"/>
+                <w:rFonts w:hint="eastAsia"/>
+                <w:i w:val="0"/>
+                <w:iCs w:val="0"/>
+                <w:color w:val="auto"/>
+              </w:rPr>
+            </w:pPr>
+            <w:r>
+              <w:rPr>
+                <w:rStyle w:val="a7"/>
+                <w:rFonts w:hint="eastAsia"/>
+                <w:i w:val="0"/>
+                <w:iCs w:val="0"/>
+                <w:color w:val="auto"/>
+              </w:rPr>
+              <w:t>执行</w:t>
+            </w:r>
+            <w:r>
+              <w:rPr>
+                <w:rStyle w:val="a7"/>
+                <w:rFonts w:hint="eastAsia"/>
+                <w:i w:val="0"/>
+                <w:iCs w:val="0"/>
+                <w:color w:val="auto"/>
+              </w:rPr>
+              <w:t>read data</w:t>
+            </w:r>
+            <w:r>
+              <w:rPr>
+                <w:rStyle w:val="a7"/>
+                <w:rFonts w:hint="eastAsia"/>
+                <w:i w:val="0"/>
+                <w:iCs w:val="0"/>
+                <w:color w:val="auto"/>
+              </w:rPr>
+              <w:t>阶段：</w:t>
+            </w:r>
+            <w:r>
+              <w:rPr>
+                <w:rStyle w:val="a7"/>
+                <w:rFonts w:hint="eastAsia"/>
+                <w:b w:val="0"/>
+                <w:bCs w:val="0"/>
+                <w:i w:val="0"/>
+                <w:iCs w:val="0"/>
+                <w:color w:val="auto"/>
+              </w:rPr>
+              <w:t>熟悉</w:t>
+            </w:r>
+            <w:r>
+              <w:rPr>
+                <w:rStyle w:val="a7"/>
+                <w:rFonts w:hint="eastAsia"/>
+                <w:b w:val="0"/>
+                <w:bCs w:val="0"/>
+                <w:i w:val="0"/>
+                <w:iCs w:val="0"/>
+                <w:color w:val="auto"/>
+              </w:rPr>
+              <w:t>DP</w:t>
+            </w:r>
+            <w:r>
+              <w:rPr>
+                <w:rStyle w:val="a7"/>
+                <w:rFonts w:hint="eastAsia"/>
+                <w:b w:val="0"/>
+                <w:bCs w:val="0"/>
+                <w:i w:val="0"/>
+                <w:iCs w:val="0"/>
+                <w:color w:val="auto"/>
+              </w:rPr>
+              <w:t>视角，大概了解每篇帖子的内容和组织</w:t>
+            </w:r>
+            <w:r>
+              <w:rPr>
+                <w:rStyle w:val="a7"/>
+                <w:rFonts w:hint="eastAsia"/>
+                <w:b w:val="0"/>
+                <w:bCs w:val="0"/>
+                <w:i w:val="0"/>
+                <w:iCs w:val="0"/>
+                <w:color w:val="auto"/>
+              </w:rPr>
+              <w:t>，自称的发</w:t>
+            </w:r>
+            <w:proofErr w:type="gramStart"/>
+            <w:r>
+              <w:rPr>
+                <w:rStyle w:val="a7"/>
+                <w:rFonts w:hint="eastAsia"/>
+                <w:b w:val="0"/>
+                <w:bCs w:val="0"/>
+                <w:i w:val="0"/>
+                <w:iCs w:val="0"/>
+                <w:color w:val="auto"/>
+              </w:rPr>
+              <w:t>帖目的</w:t>
+            </w:r>
+            <w:proofErr w:type="gramEnd"/>
+            <w:r>
+              <w:rPr>
+                <w:rStyle w:val="a7"/>
+                <w:rFonts w:hint="eastAsia"/>
+                <w:b w:val="0"/>
+                <w:bCs w:val="0"/>
+                <w:i w:val="0"/>
+                <w:iCs w:val="0"/>
+                <w:color w:val="auto"/>
+              </w:rPr>
+              <w:t>是什么</w:t>
+            </w:r>
+          </w:p>
+        </w:tc>
+      </w:tr>
+      <w:tr>
+        <w:tc>
+          <w:tcPr>
+            <w:tcW w:w="2972" w:type="dxa"/>
+          </w:tcPr>
+          <w:p>
+            <w:pPr>
+              <w:rPr>
+                <w:rStyle w:val="a7"/>
+                <w:rFonts w:hint="eastAsia"/>
+                <w:b w:val="0"/>
+                <w:bCs w:val="0"/>
+                <w:i w:val="0"/>
+                <w:iCs w:val="0"/>
+                <w:color w:val="auto"/>
+              </w:rPr>
+            </w:pPr>
+            <w:r>
+              <w:rPr>
+                <w:rStyle w:val="a7"/>
+                <w:rFonts w:hint="eastAsia"/>
+                <w:b w:val="0"/>
+                <w:bCs w:val="0"/>
+                <w:i w:val="0"/>
+                <w:iCs w:val="0"/>
+                <w:color w:val="auto"/>
+              </w:rPr>
+              <w:t>精读每篇帖子</w:t>
+            </w:r>
+          </w:p>
+        </w:tc>
+        <w:tc>
+          <w:tcPr>
+            <w:tcW w:w="6378" w:type="dxa"/>
+          </w:tcPr>
+          <w:p>
+            <w:pPr>
+              <w:rPr>
+                <w:rStyle w:val="a7"/>
+                <w:rFonts w:hint="eastAsia"/>
+                <w:b w:val="0"/>
+                <w:bCs w:val="0"/>
+                <w:i w:val="0"/>
+                <w:iCs w:val="0"/>
+                <w:color w:val="auto"/>
+              </w:rPr>
+            </w:pPr>
+            <w:r>
+              <w:rPr>
+                <w:rStyle w:val="a7"/>
+                <w:rFonts w:hint="eastAsia"/>
+                <w:i w:val="0"/>
+                <w:iCs w:val="0"/>
+                <w:color w:val="auto"/>
+              </w:rPr>
+              <w:t>综合执行</w:t>
+            </w:r>
+            <w:r>
+              <w:rPr>
+                <w:rStyle w:val="a7"/>
+                <w:rFonts w:hint="eastAsia"/>
+                <w:i w:val="0"/>
+                <w:iCs w:val="0"/>
+                <w:color w:val="auto"/>
+              </w:rPr>
+              <w:t xml:space="preserve">read </w:t>
+            </w:r>
+            <w:r>
+              <w:rPr>
+                <w:rStyle w:val="a7"/>
+                <w:rFonts w:hint="eastAsia"/>
+                <w:i w:val="0"/>
+                <w:iCs w:val="0"/>
+                <w:color w:val="auto"/>
+              </w:rPr>
+              <w:t>和</w:t>
+            </w:r>
+            <w:r>
+              <w:rPr>
+                <w:rStyle w:val="a7"/>
+                <w:rFonts w:hint="eastAsia"/>
+                <w:i w:val="0"/>
+                <w:iCs w:val="0"/>
+                <w:color w:val="auto"/>
+              </w:rPr>
+              <w:t>describe data</w:t>
+            </w:r>
+            <w:r>
+              <w:rPr>
+                <w:rStyle w:val="a7"/>
+                <w:rFonts w:hint="eastAsia"/>
+                <w:i w:val="0"/>
+                <w:iCs w:val="0"/>
+                <w:color w:val="auto"/>
+              </w:rPr>
+              <w:t>阶段</w:t>
+            </w:r>
+            <w:r>
+              <w:rPr>
+                <w:rStyle w:val="a7"/>
+                <w:rFonts w:hint="eastAsia"/>
+                <w:i w:val="0"/>
+                <w:iCs w:val="0"/>
+                <w:color w:val="auto"/>
+              </w:rPr>
+              <w:t xml:space="preserve"> </w:t>
+            </w:r>
+            <w:r>
+              <w:rPr>
+                <w:rStyle w:val="a7"/>
+                <w:rFonts w:hint="eastAsia"/>
+                <w:i w:val="0"/>
+                <w:iCs w:val="0"/>
+                <w:color w:val="auto"/>
+              </w:rPr>
+              <w:t>（停留在内容识别阶段）</w:t>
+            </w:r>
+            <w:r>
+              <w:rPr>
+                <w:rStyle w:val="a7"/>
+                <w:rFonts w:hint="eastAsia"/>
+                <w:b w:val="0"/>
+                <w:bCs w:val="0"/>
+                <w:i w:val="0"/>
+                <w:iCs w:val="0"/>
+                <w:color w:val="auto"/>
+              </w:rPr>
+              <w:t>：</w:t>
+            </w:r>
+          </w:p>
+        </w:tc>
+      </w:tr>
+    </w:tbl>
+    <w:p>
+      <w:pPr>
+        <w:rPr>
+          <w:rStyle w:val="a7"/>
+        </w:rPr>
+      </w:pPr>
+    </w:p>
+    <w:p>
+      <w:pPr>
+        <w:pStyle w:val="2"/>
+      </w:pPr>
+      <w:r>
+        <w:rPr>
+          <w:rFonts w:hint="eastAsia"/>
+        </w:rPr>
         <w:t>我的研究的资料是什么情况</w:t>
       </w:r>
     </w:p>
@@ -941,12 +4065,14 @@
               </w:rPr>
               <w:t>用来和</w:t>
             </w:r>
+            <w:proofErr w:type="spellStart"/>
             <w:r>
               <w:rPr>
                 <w:rFonts w:hint="eastAsia"/>
               </w:rPr>
               <w:t>mentalhealth</w:t>
             </w:r>
+            <w:proofErr w:type="spellEnd"/>
             <w:r>
               <w:rPr>
                 <w:rFonts w:hint="eastAsia"/>
@@ -1216,7 +4342,21 @@
               <w:rPr>
                 <w:rFonts w:hint="eastAsia"/>
               </w:rPr>
-              <w:t>这种其他类型含量极少，而且不内耗，在其他社区更为典型</w:t>
+              <w:t>这种其他类型含量极少，而且</w:t>
+            </w:r>
+            <w:proofErr w:type="gramStart"/>
+            <w:r>
+              <w:rPr>
+                <w:rFonts w:hint="eastAsia"/>
+              </w:rPr>
+              <w:t>不</w:t>
+            </w:r>
+            <w:proofErr w:type="gramEnd"/>
+            <w:r>
+              <w:rPr>
+                <w:rFonts w:hint="eastAsia"/>
+              </w:rPr>
+              <w:t>内耗，在其他社区更为典型</w:t>
             </w:r>
           </w:p>
         </w:tc>
@@ -1436,11 +4576,19 @@
               </w:rPr>
               <w:t xml:space="preserve"> Supplement</w:t>
             </w:r>
-            <w:r>
-              <w:rPr>
-                <w:rFonts w:hint="eastAsia"/>
-              </w:rPr>
-              <w:t>占比极小，但也的确是真的</w:t>
+            <w:proofErr w:type="gramStart"/>
+            <w:r>
+              <w:rPr>
+                <w:rFonts w:hint="eastAsia"/>
+              </w:rPr>
+              <w:t>占比极小</w:t>
+            </w:r>
+            <w:proofErr w:type="gramEnd"/>
+            <w:r>
+              <w:rPr>
+                <w:rFonts w:hint="eastAsia"/>
+              </w:rPr>
+              <w:t>，但也的确是真的</w:t>
             </w:r>
             <w:r>
               <w:rPr>
@@ -1543,7 +4691,14 @@
               <w:rPr>
                 <w:rFonts w:hint="eastAsia"/>
               </w:rPr>
-              <w:t>系的提到对</w:t>
+              <w:t>系的提</w:t>
+            </w:r>
+            <w:r>
+              <w:rPr>
+                <w:rFonts w:hint="eastAsia"/>
+              </w:rPr>
+              <w:lastRenderedPageBreak/>
+              <w:t>到对</w:t>
             </w:r>
             <w:r>
               <w:rPr>
@@ -1823,11 +4978,19 @@
               </w:rPr>
               <w:t xml:space="preserve">2. </w:t>
             </w:r>
-            <w:r>
-              <w:rPr>
-                <w:rFonts w:hint="eastAsia"/>
-              </w:rPr>
-              <w:t>任何跟“确认”有关的</w:t>
+            <w:proofErr w:type="gramStart"/>
+            <w:r>
+              <w:rPr>
+                <w:rFonts w:hint="eastAsia"/>
+              </w:rPr>
+              <w:t>任何跟“</w:t>
+            </w:r>
+            <w:proofErr w:type="gramEnd"/>
+            <w:r>
+              <w:rPr>
+                <w:rFonts w:hint="eastAsia"/>
+              </w:rPr>
+              <w:t>确认”有关的</w:t>
             </w:r>
             <w:r>
               <w:rPr>
@@ -1909,9 +5072,16 @@
         <w:rPr>
           <w:rFonts w:hint="eastAsia"/>
         </w:rPr>
-        <w:lastRenderedPageBreak/>
-        <w:t>r/mentalhealth</w:t>
-      </w:r>
+        <w:t>r/</w:t>
+      </w:r>
+      <w:proofErr w:type="spellStart"/>
+      <w:r>
+        <w:rPr>
+          <w:rFonts w:hint="eastAsia"/>
+        </w:rPr>
+        <w:t>mentalhealth</w:t>
+      </w:r>
+      <w:proofErr w:type="spellEnd"/>
     </w:p>
     <w:tbl>
       <w:tblPr>
@@ -2105,11 +5275,6 @@
             </w:r>
           </w:p>
           <w:p>
-            <w:pPr>
-              <w:rPr>
-                <w:rFonts w:hint="eastAsia"/>
-              </w:rPr>
-            </w:pPr>
             <w:r>
               <w:t>S</w:t>
             </w:r>
@@ -2207,11 +5372,6 @@
             </w:r>
           </w:p>
           <w:p>
-            <w:pPr>
-              <w:rPr>
-                <w:rFonts w:hint="eastAsia"/>
-              </w:rPr>
-            </w:pPr>
             <w:r>
               <w:t>E</w:t>
             </w:r>
@@ -2268,9 +5428,6 @@
                 <w:ilvl w:val="0"/>
                 <w:numId w:val="15"/>
               </w:numPr>
-              <w:rPr>
-                <w:rFonts w:hint="eastAsia"/>
-              </w:rPr>
             </w:pPr>
             <w:r>
               <w:rPr>
@@ -2652,7 +5809,6 @@
             <w:pPr>
               <w:rPr>
                 <w:rStyle w:val="a7"/>
-                <w:rFonts w:hint="eastAsia"/>
               </w:rPr>
             </w:pPr>
             <w:r>
@@ -2669,11 +5825,6 @@
             <w:tcW w:w="3261" w:type="dxa"/>
           </w:tcPr>
           <w:p>
-            <w:pPr>
-              <w:rPr>
-                <w:rFonts w:hint="eastAsia"/>
-              </w:rPr>
-            </w:pPr>
             <w:r>
               <w:t>Primary x Habitual x TA</w:t>
             </w:r>
@@ -2683,12 +5834,14 @@
               </w:rPr>
               <w:t>最多，但是跟</w:t>
             </w:r>
+            <w:proofErr w:type="spellStart"/>
             <w:r>
               <w:rPr>
                 <w:rFonts w:hint="eastAsia"/>
               </w:rPr>
               <w:t>therapyGPT</w:t>
             </w:r>
+            <w:proofErr w:type="spellEnd"/>
             <w:r>
               <w:rPr>
                 <w:rFonts w:hint="eastAsia"/>
@@ -2739,11 +5892,6 @@
             <w:vMerge w:val="restart"/>
           </w:tcPr>
           <w:p>
-            <w:pPr>
-              <w:rPr>
-                <w:rFonts w:hint="eastAsia"/>
-              </w:rPr>
-            </w:pPr>
             <w:r>
               <w:t>Primary x Habitual x TA</w:t>
             </w:r>
@@ -2770,7 +5918,11 @@
           </w:p>
           <w:p>
             <w:r>
-              <w:t>Primary x Habitual x TA</w:t>
+              <w:t xml:space="preserve">Primary x Habitual x </w:t>
+            </w:r>
+            <w:proofErr w:type="gramStart"/>
+            <w:r>
+              <w:t>TA</w:t>
             </w:r>
             <w:r>
               <w:rPr>
@@ -2778,6 +5930,7 @@
               </w:rPr>
               <w:t>(</w:t>
             </w:r>
+            <w:proofErr w:type="gramEnd"/>
             <w:r>
               <w:rPr>
                 <w:rFonts w:hint="eastAsia"/>
@@ -2869,12 +6022,14 @@
               </w:rPr>
               <w:t>和</w:t>
             </w:r>
+            <w:proofErr w:type="spellStart"/>
             <w:r>
               <w:rPr>
                 <w:rFonts w:hint="eastAsia"/>
               </w:rPr>
               <w:t>therapyGPT</w:t>
             </w:r>
+            <w:proofErr w:type="spellEnd"/>
             <w:r>
               <w:rPr>
                 <w:rFonts w:hint="eastAsia"/>
@@ -2889,9 +6044,6 @@
                 <w:ilvl w:val="0"/>
                 <w:numId w:val="15"/>
               </w:numPr>
-              <w:rPr>
-                <w:rFonts w:hint="eastAsia"/>
-              </w:rPr>
             </w:pPr>
             <w:r>
               <w:rPr>
@@ -2905,12 +6057,14 @@
               </w:rPr>
               <w:t>TA</w:t>
             </w:r>
+            <w:proofErr w:type="gramStart"/>
             <w:r>
               <w:rPr>
                 <w:rFonts w:hint="eastAsia"/>
               </w:rPr>
               <w:t>用于找觉得</w:t>
             </w:r>
+            <w:proofErr w:type="gramEnd"/>
             <w:r>
               <w:rPr>
                 <w:rFonts w:hint="eastAsia"/>
@@ -2949,11 +6103,6 @@
             <w:tcW w:w="3261" w:type="dxa"/>
           </w:tcPr>
           <w:p>
-            <w:pPr>
-              <w:rPr>
-                <w:rFonts w:hint="eastAsia"/>
-              </w:rPr>
-            </w:pPr>
             <w:r>
               <w:rPr>
                 <w:rFonts w:hint="eastAsia"/>
@@ -3029,11 +6178,6 @@
             <w:tcW w:w="3261" w:type="dxa"/>
           </w:tcPr>
           <w:p>
-            <w:pPr>
-              <w:rPr>
-                <w:rFonts w:hint="eastAsia"/>
-              </w:rPr>
-            </w:pPr>
             <w:r>
               <w:rPr>
                 <w:rFonts w:hint="eastAsia"/>
@@ -3096,26 +6240,17 @@
         <w:rPr>
           <w:rFonts w:hint="eastAsia"/>
         </w:rPr>
+        <w:lastRenderedPageBreak/>
         <w:t>r/</w:t>
       </w:r>
-      <w:r>
-        <w:rPr>
-          <w:rFonts w:hint="eastAsia"/>
-        </w:rPr>
-        <w:t>t</w:t>
-      </w:r>
-      <w:r>
-        <w:rPr>
-          <w:rFonts w:hint="eastAsia"/>
-        </w:rPr>
-        <w:t>herapy</w:t>
-      </w:r>
-      <w:r>
-        <w:rPr>
-          <w:rFonts w:hint="eastAsia"/>
-        </w:rPr>
-        <w:t>GPT</w:t>
-      </w:r>
+      <w:proofErr w:type="spellStart"/>
+      <w:r>
+        <w:rPr>
+          <w:rFonts w:hint="eastAsia"/>
+        </w:rPr>
+        <w:t>therapyGPT</w:t>
+      </w:r>
+      <w:proofErr w:type="spellEnd"/>
     </w:p>
     <w:tbl>
       <w:tblPr>
@@ -3248,11 +6383,6 @@
             <w:tcW w:w="3261" w:type="dxa"/>
           </w:tcPr>
           <w:p>
-            <w:pPr>
-              <w:rPr>
-                <w:rFonts w:hint="eastAsia"/>
-              </w:rPr>
-            </w:pPr>
             <w:r>
               <w:t>Primary x Habitual x TA</w:t>
             </w:r>
@@ -3260,13 +6390,7 @@
               <w:rPr>
                 <w:rFonts w:hint="eastAsia"/>
               </w:rPr>
-              <w:t>最多，</w:t>
-            </w:r>
-            <w:r>
-              <w:rPr>
-                <w:rFonts w:hint="eastAsia"/>
-              </w:rPr>
-              <w:t>为此积极辩护</w:t>
+              <w:t>最多，为此积极辩护</w:t>
             </w:r>
           </w:p>
         </w:tc>
@@ -3287,11 +6411,6 @@
             </w:r>
           </w:p>
           <w:p>
-            <w:pPr>
-              <w:rPr>
-                <w:rFonts w:hint="eastAsia"/>
-              </w:rPr>
-            </w:pPr>
             <w:r>
               <w:rPr>
                 <w:rFonts w:hint="eastAsia"/>
@@ -3321,7 +6440,11 @@
           </w:p>
           <w:p>
             <w:r>
-              <w:t>Primary x Habitual x TA</w:t>
+              <w:t xml:space="preserve">Primary x Habitual x </w:t>
+            </w:r>
+            <w:proofErr w:type="gramStart"/>
+            <w:r>
+              <w:t>TA</w:t>
             </w:r>
             <w:r>
               <w:rPr>
@@ -3329,17 +6452,12 @@
               </w:rPr>
               <w:t>(</w:t>
             </w:r>
-            <w:r>
-              <w:rPr>
-                <w:rFonts w:hint="eastAsia"/>
-              </w:rPr>
-              <w:t>5</w:t>
-            </w:r>
-            <w:r>
-              <w:rPr>
-                <w:rFonts w:hint="eastAsia"/>
-              </w:rPr>
-              <w:t>)</w:t>
+            <w:proofErr w:type="gramEnd"/>
+            <w:r>
+              <w:rPr>
+                <w:rFonts w:hint="eastAsia"/>
+              </w:rPr>
+              <w:t>5)</w:t>
             </w:r>
           </w:p>
           <w:p>
@@ -3412,7 +6530,6 @@
               <w:rPr>
                 <w:rFonts w:hint="eastAsia"/>
               </w:rPr>
-              <w:lastRenderedPageBreak/>
               <w:t>TA</w:t>
             </w:r>
             <w:r>
@@ -3437,7 +6554,21 @@
               <w:rPr>
                 <w:rFonts w:hint="eastAsia"/>
               </w:rPr>
-              <w:t>，而且是这研究里最有价值的语料</w:t>
+              <w:t>，而且是</w:t>
+            </w:r>
+            <w:proofErr w:type="gramStart"/>
+            <w:r>
+              <w:rPr>
+                <w:rFonts w:hint="eastAsia"/>
+              </w:rPr>
+              <w:t>这研究</w:t>
+            </w:r>
+            <w:proofErr w:type="gramEnd"/>
+            <w:r>
+              <w:rPr>
+                <w:rFonts w:hint="eastAsia"/>
+              </w:rPr>
+              <w:t>里最有价值的语料</w:t>
             </w:r>
           </w:p>
           <w:p>
@@ -3524,22 +6655,11 @@
             <w:tcW w:w="3261" w:type="dxa"/>
           </w:tcPr>
           <w:p>
-            <w:pPr>
-              <w:rPr>
-                <w:rFonts w:hint="eastAsia"/>
-              </w:rPr>
-            </w:pPr>
-            <w:r>
-              <w:rPr>
-                <w:rFonts w:hint="eastAsia"/>
-              </w:rPr>
-              <w:t>NM x Habitual x TA</w:t>
-            </w:r>
-            <w:r>
-              <w:rPr>
-                <w:rFonts w:hint="eastAsia"/>
-              </w:rPr>
-              <w:t xml:space="preserve"> </w:t>
+            <w:r>
+              <w:rPr>
+                <w:rFonts w:hint="eastAsia"/>
+              </w:rPr>
+              <w:t xml:space="preserve">NM x Habitual x TA </w:t>
             </w:r>
             <w:r>
               <w:rPr>
@@ -3586,11 +6706,6 @@
             <w:tcW w:w="3261" w:type="dxa"/>
           </w:tcPr>
           <w:p>
-            <w:pPr>
-              <w:rPr>
-                <w:rFonts w:hint="eastAsia"/>
-              </w:rPr>
-            </w:pPr>
             <w:r>
               <w:rPr>
                 <w:rFonts w:hint="eastAsia"/>
@@ -3652,11 +6767,6 @@
       </w:r>
     </w:p>
     <w:p>
-      <w:pPr>
-        <w:rPr>
-          <w:rFonts w:hint="eastAsia"/>
-        </w:rPr>
-      </w:pPr>
       <w:r>
         <w:rPr>
           <w:rFonts w:hint="eastAsia"/>
@@ -3679,13 +6789,7 @@
         <w:t>全部纳入</w:t>
       </w:r>
     </w:p>
-    <w:p>
-      <w:pPr>
-        <w:rPr>
-          <w:rFonts w:hint="eastAsia"/>
-        </w:rPr>
-      </w:pPr>
-    </w:p>
+    <w:p/>
     <w:p>
       <w:pPr>
         <w:pStyle w:val="1"/>
@@ -3758,7 +6862,14 @@
         <w:rPr>
           <w:rFonts w:hint="eastAsia"/>
         </w:rPr>
-        <w:t>self-governance</w:t>
+        <w:t>self-</w:t>
+      </w:r>
+      <w:proofErr w:type="gramStart"/>
+      <w:r>
+        <w:rPr>
+          <w:rFonts w:hint="eastAsia"/>
+        </w:rPr>
+        <w:t>governance</w:t>
       </w:r>
       <w:r>
         <w:rPr>
@@ -3766,6 +6877,7 @@
         </w:rPr>
         <w:t>也不只是孤立地看成个人所有的东西；</w:t>
       </w:r>
+      <w:proofErr w:type="gramEnd"/>
     </w:p>
     <w:p>
       <w:r>
@@ -3778,8 +6890,16 @@
         <w:rPr>
           <w:rFonts w:hint="eastAsia"/>
         </w:rPr>
-        <w:t>则完全是处境，不是特质；</w:t>
-      </w:r>
+        <w:t>则完全是处境，</w:t>
+      </w:r>
+      <w:proofErr w:type="gramStart"/>
+      <w:r>
+        <w:rPr>
+          <w:rFonts w:hint="eastAsia"/>
+        </w:rPr>
+        <w:t>不是特质；</w:t>
+      </w:r>
+      <w:proofErr w:type="gramEnd"/>
     </w:p>
     <w:p>
       <w:r>
@@ -4595,6 +7715,119 @@
     </w:lvl>
   </w:abstractNum>
   <w:abstractNum w:abstractNumId="6" w15:restartNumberingAfterBreak="0">
+    <w:nsid w:val="3D4F4ECB"/>
+    <w:multiLevelType w:val="hybridMultilevel"/>
+    <w:tmpl w:val="3C84F770"/>
+    <w:lvl w:ilvl="0" w:tplc="3DE4C1B2">
+      <w:start w:val="1"/>
+      <w:numFmt w:val="bullet"/>
+      <w:lvlText w:val="-"/>
+      <w:lvlJc w:val="left"/>
+      <w:pPr>
+        <w:ind w:left="720" w:hanging="360"/>
+      </w:pPr>
+      <w:rPr>
+        <w:rFonts w:ascii="Aptos" w:eastAsiaTheme="minorEastAsia" w:hAnsi="Aptos" w:cstheme="minorBidi" w:hint="default"/>
+      </w:rPr>
+    </w:lvl>
+    <w:lvl w:ilvl="1" w:tplc="04090003" w:tentative="1">
+      <w:start w:val="1"/>
+      <w:numFmt w:val="bullet"/>
+      <w:lvlText w:val="o"/>
+      <w:lvlJc w:val="left"/>
+      <w:pPr>
+        <w:ind w:left="1440" w:hanging="360"/>
+      </w:pPr>
+      <w:rPr>
+        <w:rFonts w:ascii="Courier New" w:hAnsi="Courier New" w:cs="Courier New" w:hint="default"/>
+      </w:rPr>
+    </w:lvl>
+    <w:lvl w:ilvl="2" w:tplc="04090005" w:tentative="1">
+      <w:start w:val="1"/>
+      <w:numFmt w:val="bullet"/>
+      <w:lvlText w:val=""/>
+      <w:lvlJc w:val="left"/>
+      <w:pPr>
+        <w:ind w:left="2160" w:hanging="360"/>
+      </w:pPr>
+      <w:rPr>
+        <w:rFonts w:ascii="Wingdings" w:hAnsi="Wingdings" w:hint="default"/>
+      </w:rPr>
+    </w:lvl>
+    <w:lvl w:ilvl="3" w:tplc="04090001" w:tentative="1">
+      <w:start w:val="1"/>
+      <w:numFmt w:val="bullet"/>
+      <w:lvlText w:val=""/>
+      <w:lvlJc w:val="left"/>
+      <w:pPr>
+        <w:ind w:left="2880" w:hanging="360"/>
+      </w:pPr>
+      <w:rPr>
+        <w:rFonts w:ascii="Symbol" w:hAnsi="Symbol" w:hint="default"/>
+      </w:rPr>
+    </w:lvl>
+    <w:lvl w:ilvl="4" w:tplc="04090003" w:tentative="1">
+      <w:start w:val="1"/>
+      <w:numFmt w:val="bullet"/>
+      <w:lvlText w:val="o"/>
+      <w:lvlJc w:val="left"/>
+      <w:pPr>
+        <w:ind w:left="3600" w:hanging="360"/>
+      </w:pPr>
+      <w:rPr>
+        <w:rFonts w:ascii="Courier New" w:hAnsi="Courier New" w:cs="Courier New" w:hint="default"/>
+      </w:rPr>
+    </w:lvl>
+    <w:lvl w:ilvl="5" w:tplc="04090005" w:tentative="1">
+      <w:start w:val="1"/>
+      <w:numFmt w:val="bullet"/>
+      <w:lvlText w:val=""/>
+      <w:lvlJc w:val="left"/>
+      <w:pPr>
+        <w:ind w:left="4320" w:hanging="360"/>
+      </w:pPr>
+      <w:rPr>
+        <w:rFonts w:ascii="Wingdings" w:hAnsi="Wingdings" w:hint="default"/>
+      </w:rPr>
+    </w:lvl>
+    <w:lvl w:ilvl="6" w:tplc="04090001" w:tentative="1">
+      <w:start w:val="1"/>
+      <w:numFmt w:val="bullet"/>
+      <w:lvlText w:val=""/>
+      <w:lvlJc w:val="left"/>
+      <w:pPr>
+        <w:ind w:left="5040" w:hanging="360"/>
+      </w:pPr>
+      <w:rPr>
+        <w:rFonts w:ascii="Symbol" w:hAnsi="Symbol" w:hint="default"/>
+      </w:rPr>
+    </w:lvl>
+    <w:lvl w:ilvl="7" w:tplc="04090003" w:tentative="1">
+      <w:start w:val="1"/>
+      <w:numFmt w:val="bullet"/>
+      <w:lvlText w:val="o"/>
+      <w:lvlJc w:val="left"/>
+      <w:pPr>
+        <w:ind w:left="5760" w:hanging="360"/>
+      </w:pPr>
+      <w:rPr>
+        <w:rFonts w:ascii="Courier New" w:hAnsi="Courier New" w:cs="Courier New" w:hint="default"/>
+      </w:rPr>
+    </w:lvl>
+    <w:lvl w:ilvl="8" w:tplc="04090005" w:tentative="1">
+      <w:start w:val="1"/>
+      <w:numFmt w:val="bullet"/>
+      <w:lvlText w:val=""/>
+      <w:lvlJc w:val="left"/>
+      <w:pPr>
+        <w:ind w:left="6480" w:hanging="360"/>
+      </w:pPr>
+      <w:rPr>
+        <w:rFonts w:ascii="Wingdings" w:hAnsi="Wingdings" w:hint="default"/>
+      </w:rPr>
+    </w:lvl>
+  </w:abstractNum>
+  <w:abstractNum w:abstractNumId="7" w15:restartNumberingAfterBreak="0">
     <w:nsid w:val="7C4231CD"/>
     <w:multiLevelType w:val="hybridMultilevel"/>
     <w:tmpl w:val="1C569208"/>
@@ -4741,7 +7974,7 @@
     <w:abstractNumId w:val="3"/>
   </w:num>
   <w:num w:numId="12" w16cid:durableId="1308323320">
-    <w:abstractNumId w:val="6"/>
+    <w:abstractNumId w:val="7"/>
   </w:num>
   <w:num w:numId="13" w16cid:durableId="87238848">
     <w:abstractNumId w:val="1"/>
@@ -4754,6 +7987,9 @@
   </w:num>
   <w:num w:numId="16" w16cid:durableId="2048724167">
     <w:abstractNumId w:val="4"/>
+  </w:num>
+  <w:num w:numId="17" w16cid:durableId="951207961">
+    <w:abstractNumId w:val="6"/>
   </w:num>
 </w:numbering>
 </file>

</xml_diff>